<commit_message>
dfd and flowchart updated
</commit_message>
<xml_diff>
--- a/documentation.docx
+++ b/documentation.docx
@@ -369,7 +369,7 @@
           </mc:Choice>
           <mc:Fallback>
             <w:pict>
-              <v:group w14:anchorId="46BC65C3" id="Group 5" o:spid="_x0000_s1026" style="width:68.5pt;height:110pt;mso-position-horizontal-relative:char;mso-position-vertical-relative:line" coordsize="6762,16097" o:gfxdata="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">
+              <v:group w14:anchorId="06F45808" id="Group 5" o:spid="_x0000_s1026" style="width:68.5pt;height:110pt;mso-position-horizontal-relative:char;mso-position-vertical-relative:line" coordsize="6762,16097" o:gfxdata="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">
                 <v:line id="Straight Connector 2" o:spid="_x0000_s1027" style="position:absolute;visibility:visible;mso-wrap-style:square" from="3333,0" to="3333,16097" o:connectortype="straight" o:gfxdata="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" strokecolor="black [3200]" strokeweight="2.5pt">
                   <v:stroke joinstyle="miter"/>
                 </v:line>
@@ -1118,7 +1118,7 @@
           <w:noProof/>
           <w:szCs w:val="24"/>
         </w:rPr>
-        <w:t>09/07/2026</w:t>
+        <w:t>10/07/2026</w:t>
       </w:r>
       <w:r>
         <w:rPr>
@@ -2559,7 +2559,7 @@
                 <w:noProof/>
                 <w:webHidden/>
               </w:rPr>
-              <w:t>11</w:t>
+              <w:t>12</w:t>
             </w:r>
             <w:r>
               <w:rPr>
@@ -2647,7 +2647,7 @@
                 <w:noProof/>
                 <w:webHidden/>
               </w:rPr>
-              <w:t>12</w:t>
+              <w:t>14</w:t>
             </w:r>
             <w:r>
               <w:rPr>
@@ -2735,7 +2735,7 @@
                 <w:noProof/>
                 <w:webHidden/>
               </w:rPr>
-              <w:t>13</w:t>
+              <w:t>15</w:t>
             </w:r>
             <w:r>
               <w:rPr>
@@ -2823,7 +2823,7 @@
                 <w:noProof/>
                 <w:webHidden/>
               </w:rPr>
-              <w:t>14</w:t>
+              <w:t>16</w:t>
             </w:r>
             <w:r>
               <w:rPr>
@@ -2918,7 +2918,7 @@
                 <w:noProof/>
                 <w:webHidden/>
               </w:rPr>
-              <w:t>14</w:t>
+              <w:t>16</w:t>
             </w:r>
             <w:r>
               <w:rPr>
@@ -3010,7 +3010,7 @@
                 <w:noProof/>
                 <w:webHidden/>
               </w:rPr>
-              <w:t>14</w:t>
+              <w:t>16</w:t>
             </w:r>
             <w:r>
               <w:rPr>
@@ -3102,7 +3102,7 @@
                 <w:noProof/>
                 <w:webHidden/>
               </w:rPr>
-              <w:t>14</w:t>
+              <w:t>16</w:t>
             </w:r>
             <w:r>
               <w:rPr>
@@ -3194,7 +3194,7 @@
                 <w:noProof/>
                 <w:webHidden/>
               </w:rPr>
-              <w:t>14</w:t>
+              <w:t>16</w:t>
             </w:r>
             <w:r>
               <w:rPr>
@@ -3286,7 +3286,7 @@
                 <w:noProof/>
                 <w:webHidden/>
               </w:rPr>
-              <w:t>14</w:t>
+              <w:t>17</w:t>
             </w:r>
             <w:r>
               <w:rPr>
@@ -3378,7 +3378,7 @@
                 <w:noProof/>
                 <w:webHidden/>
               </w:rPr>
-              <w:t>15</w:t>
+              <w:t>17</w:t>
             </w:r>
             <w:r>
               <w:rPr>
@@ -3466,7 +3466,7 @@
                 <w:noProof/>
                 <w:webHidden/>
               </w:rPr>
-              <w:t>16</w:t>
+              <w:t>18</w:t>
             </w:r>
             <w:r>
               <w:rPr>
@@ -3558,7 +3558,7 @@
                 <w:noProof/>
                 <w:webHidden/>
               </w:rPr>
-              <w:t>16</w:t>
+              <w:t>19</w:t>
             </w:r>
             <w:r>
               <w:rPr>
@@ -3650,7 +3650,7 @@
                 <w:noProof/>
                 <w:webHidden/>
               </w:rPr>
-              <w:t>16</w:t>
+              <w:t>22</w:t>
             </w:r>
             <w:r>
               <w:rPr>
@@ -3738,7 +3738,7 @@
                 <w:noProof/>
                 <w:webHidden/>
               </w:rPr>
-              <w:t>18</w:t>
+              <w:t>23</w:t>
             </w:r>
             <w:r>
               <w:rPr>
@@ -3830,7 +3830,7 @@
                 <w:noProof/>
                 <w:webHidden/>
               </w:rPr>
-              <w:t>18</w:t>
+              <w:t>23</w:t>
             </w:r>
             <w:r>
               <w:rPr>
@@ -3922,7 +3922,7 @@
                 <w:noProof/>
                 <w:webHidden/>
               </w:rPr>
-              <w:t>18</w:t>
+              <w:t>23</w:t>
             </w:r>
             <w:r>
               <w:rPr>
@@ -4015,7 +4015,7 @@
                 <w:noProof/>
                 <w:webHidden/>
               </w:rPr>
-              <w:t>18</w:t>
+              <w:t>23</w:t>
             </w:r>
             <w:r>
               <w:rPr>
@@ -4103,7 +4103,7 @@
                 <w:noProof/>
                 <w:webHidden/>
               </w:rPr>
-              <w:t>19</w:t>
+              <w:t>24</w:t>
             </w:r>
             <w:r>
               <w:rPr>
@@ -4148,24 +4148,24 @@
                 <w:lang w:val="en-US"/>
                 <w14:ligatures w14:val="standardContextual"/>
               </w:rPr>
+              <w:t xml:space="preserve"> </w:t>
+            </w:r>
+            <w:r>
+              <w:rPr>
+                <w:rStyle w:val="Hyperlink"/>
+                <w:noProof/>
+              </w:rPr>
+              <w:t>Example of a Test Case</w:t>
+            </w:r>
+            <w:r>
+              <w:rPr>
+                <w:noProof/>
+                <w:webHidden/>
+              </w:rPr>
               <w:tab/>
             </w:r>
             <w:r>
               <w:rPr>
-                <w:rStyle w:val="Hyperlink"/>
-                <w:noProof/>
-              </w:rPr>
-              <w:t>Example of a Test Case</w:t>
-            </w:r>
-            <w:r>
-              <w:rPr>
-                <w:noProof/>
-                <w:webHidden/>
-              </w:rPr>
-              <w:tab/>
-            </w:r>
-            <w:r>
-              <w:rPr>
                 <w:noProof/>
                 <w:webHidden/>
               </w:rPr>
@@ -4196,7 +4196,7 @@
                 <w:noProof/>
                 <w:webHidden/>
               </w:rPr>
-              <w:t>19</w:t>
+              <w:t>24</w:t>
             </w:r>
             <w:r>
               <w:rPr>
@@ -4241,24 +4241,24 @@
                 <w:lang w:val="en-US"/>
                 <w14:ligatures w14:val="standardContextual"/>
               </w:rPr>
+              <w:t xml:space="preserve"> </w:t>
+            </w:r>
+            <w:r>
+              <w:rPr>
+                <w:rStyle w:val="Hyperlink"/>
+                <w:noProof/>
+              </w:rPr>
+              <w:t>Test Matrix of Tested Modules</w:t>
+            </w:r>
+            <w:r>
+              <w:rPr>
+                <w:noProof/>
+                <w:webHidden/>
+              </w:rPr>
               <w:tab/>
             </w:r>
             <w:r>
               <w:rPr>
-                <w:rStyle w:val="Hyperlink"/>
-                <w:noProof/>
-              </w:rPr>
-              <w:t>Test Matrix of Tested Modules</w:t>
-            </w:r>
-            <w:r>
-              <w:rPr>
-                <w:noProof/>
-                <w:webHidden/>
-              </w:rPr>
-              <w:tab/>
-            </w:r>
-            <w:r>
-              <w:rPr>
                 <w:noProof/>
                 <w:webHidden/>
               </w:rPr>
@@ -4289,7 +4289,7 @@
                 <w:noProof/>
                 <w:webHidden/>
               </w:rPr>
-              <w:t>20</w:t>
+              <w:t>25</w:t>
             </w:r>
             <w:r>
               <w:rPr>
@@ -4334,24 +4334,24 @@
                 <w:lang w:val="en-US"/>
                 <w14:ligatures w14:val="standardContextual"/>
               </w:rPr>
+              <w:t xml:space="preserve"> </w:t>
+            </w:r>
+            <w:r>
+              <w:rPr>
+                <w:rStyle w:val="Hyperlink"/>
+                <w:noProof/>
+              </w:rPr>
+              <w:t>Requirement Traceability Matrix</w:t>
+            </w:r>
+            <w:r>
+              <w:rPr>
+                <w:noProof/>
+                <w:webHidden/>
+              </w:rPr>
               <w:tab/>
             </w:r>
             <w:r>
               <w:rPr>
-                <w:rStyle w:val="Hyperlink"/>
-                <w:noProof/>
-              </w:rPr>
-              <w:t>Requirement Traceability Matrix</w:t>
-            </w:r>
-            <w:r>
-              <w:rPr>
-                <w:noProof/>
-                <w:webHidden/>
-              </w:rPr>
-              <w:tab/>
-            </w:r>
-            <w:r>
-              <w:rPr>
                 <w:noProof/>
                 <w:webHidden/>
               </w:rPr>
@@ -4382,7 +4382,7 @@
                 <w:noProof/>
                 <w:webHidden/>
               </w:rPr>
-              <w:t>20</w:t>
+              <w:t>25</w:t>
             </w:r>
             <w:r>
               <w:rPr>
@@ -4427,24 +4427,24 @@
                 <w:lang w:val="en-US"/>
                 <w14:ligatures w14:val="standardContextual"/>
               </w:rPr>
+              <w:t xml:space="preserve"> </w:t>
+            </w:r>
+            <w:r>
+              <w:rPr>
+                <w:rStyle w:val="Hyperlink"/>
+                <w:noProof/>
+              </w:rPr>
+              <w:t>User Acceptance Testing</w:t>
+            </w:r>
+            <w:r>
+              <w:rPr>
+                <w:noProof/>
+                <w:webHidden/>
+              </w:rPr>
               <w:tab/>
             </w:r>
             <w:r>
               <w:rPr>
-                <w:rStyle w:val="Hyperlink"/>
-                <w:noProof/>
-              </w:rPr>
-              <w:t>User Acceptance Testing</w:t>
-            </w:r>
-            <w:r>
-              <w:rPr>
-                <w:noProof/>
-                <w:webHidden/>
-              </w:rPr>
-              <w:tab/>
-            </w:r>
-            <w:r>
-              <w:rPr>
                 <w:noProof/>
                 <w:webHidden/>
               </w:rPr>
@@ -4475,7 +4475,7 @@
                 <w:noProof/>
                 <w:webHidden/>
               </w:rPr>
-              <w:t>21</w:t>
+              <w:t>26</w:t>
             </w:r>
             <w:r>
               <w:rPr>
@@ -4563,7 +4563,7 @@
                 <w:noProof/>
                 <w:webHidden/>
               </w:rPr>
-              <w:t>22</w:t>
+              <w:t>27</w:t>
             </w:r>
             <w:r>
               <w:rPr>
@@ -4654,7 +4654,7 @@
                 <w:noProof/>
                 <w:webHidden/>
               </w:rPr>
-              <w:t>24</w:t>
+              <w:t>28</w:t>
             </w:r>
             <w:r>
               <w:rPr>
@@ -4745,7 +4745,7 @@
                 <w:noProof/>
                 <w:webHidden/>
               </w:rPr>
-              <w:t>25</w:t>
+              <w:t>29</w:t>
             </w:r>
             <w:r>
               <w:rPr>
@@ -4978,7 +4978,7 @@
             <w:noProof/>
             <w:webHidden/>
           </w:rPr>
-          <w:t>15</w:t>
+          <w:t>17</w:t>
         </w:r>
         <w:r>
           <w:rPr>
@@ -5052,7 +5052,7 @@
             <w:noProof/>
             <w:webHidden/>
           </w:rPr>
-          <w:t>18</w:t>
+          <w:t>23</w:t>
         </w:r>
         <w:r>
           <w:rPr>
@@ -5126,7 +5126,7 @@
             <w:noProof/>
             <w:webHidden/>
           </w:rPr>
-          <w:t>20</w:t>
+          <w:t>25</w:t>
         </w:r>
         <w:r>
           <w:rPr>
@@ -5200,7 +5200,7 @@
             <w:noProof/>
             <w:webHidden/>
           </w:rPr>
-          <w:t>21</w:t>
+          <w:t>26</w:t>
         </w:r>
         <w:r>
           <w:rPr>
@@ -5274,207 +5274,741 @@
     </w:p>
     <w:tbl>
       <w:tblPr>
-        <w:tblStyle w:val="GridTable1Light1"/>
-        <w:tblW w:w="0" w:type="auto"/>
-        <w:tblLook w:val="04A0" w:firstRow="1" w:lastRow="0" w:firstColumn="1" w:lastColumn="0" w:noHBand="0" w:noVBand="1"/>
+        <w:tblW w:w="8272" w:type="dxa"/>
+        <w:tblBorders>
+          <w:top w:val="single" w:sz="4" w:space="0" w:color="auto"/>
+          <w:left w:val="single" w:sz="4" w:space="0" w:color="auto"/>
+          <w:bottom w:val="single" w:sz="4" w:space="0" w:color="auto"/>
+          <w:right w:val="single" w:sz="4" w:space="0" w:color="auto"/>
+          <w:insideH w:val="single" w:sz="4" w:space="0" w:color="auto"/>
+          <w:insideV w:val="single" w:sz="4" w:space="0" w:color="auto"/>
+        </w:tblBorders>
+        <w:tblCellMar>
+          <w:left w:w="10" w:type="dxa"/>
+          <w:right w:w="10" w:type="dxa"/>
+        </w:tblCellMar>
+        <w:tblLook w:val="0000" w:firstRow="0" w:lastRow="0" w:firstColumn="0" w:lastColumn="0" w:noHBand="0" w:noVBand="0"/>
       </w:tblPr>
       <w:tblGrid>
-        <w:gridCol w:w="4261"/>
-        <w:gridCol w:w="4261"/>
+        <w:gridCol w:w="2588"/>
+        <w:gridCol w:w="5684"/>
       </w:tblGrid>
       <w:tr>
+        <w:tblPrEx>
+          <w:tblCellMar>
+            <w:top w:w="0" w:type="dxa"/>
+            <w:bottom w:w="0" w:type="dxa"/>
+          </w:tblCellMar>
+        </w:tblPrEx>
         <w:trPr>
-          <w:cnfStyle w:val="100000000000" w:firstRow="1" w:lastRow="0" w:firstColumn="0" w:lastColumn="0" w:oddVBand="0" w:evenVBand="0" w:oddHBand="0" w:evenHBand="0" w:firstRowFirstColumn="0" w:firstRowLastColumn="0" w:lastRowFirstColumn="0" w:lastRowLastColumn="0"/>
+          <w:trHeight w:val="517"/>
+          <w:tblHeader/>
         </w:trPr>
         <w:tc>
           <w:tcPr>
-            <w:cnfStyle w:val="001000000000" w:firstRow="0" w:lastRow="0" w:firstColumn="1" w:lastColumn="0" w:oddVBand="0" w:evenVBand="0" w:oddHBand="0" w:evenHBand="0" w:firstRowFirstColumn="0" w:firstRowLastColumn="0" w:lastRowFirstColumn="0" w:lastRowLastColumn="0"/>
-            <w:tcW w:w="4261" w:type="dxa"/>
-          </w:tcPr>
-          <w:p>
-            <w:pPr>
-              <w:spacing w:line="360" w:lineRule="auto"/>
-              <w:jc w:val="both"/>
-              <w:rPr>
-                <w:b w:val="0"/>
-                <w:highlight w:val="lightGray"/>
-              </w:rPr>
-            </w:pPr>
-          </w:p>
-        </w:tc>
-        <w:tc>
-          <w:tcPr>
-            <w:tcW w:w="4261" w:type="dxa"/>
-          </w:tcPr>
-          <w:p>
-            <w:pPr>
-              <w:spacing w:line="360" w:lineRule="auto"/>
-              <w:jc w:val="both"/>
-              <w:cnfStyle w:val="100000000000" w:firstRow="1" w:lastRow="0" w:firstColumn="0" w:lastColumn="0" w:oddVBand="0" w:evenVBand="0" w:oddHBand="0" w:evenHBand="0" w:firstRowFirstColumn="0" w:firstRowLastColumn="0" w:lastRowFirstColumn="0" w:lastRowLastColumn="0"/>
-              <w:rPr>
-                <w:highlight w:val="lightGray"/>
-              </w:rPr>
-            </w:pPr>
+            <w:tcW w:w="2588" w:type="dxa"/>
+            <w:tcBorders>
+              <w:top w:val="single" w:sz="4" w:space="0" w:color="000000"/>
+              <w:left w:val="single" w:sz="4" w:space="0" w:color="000000"/>
+              <w:bottom w:val="single" w:sz="4" w:space="0" w:color="000000"/>
+              <w:right w:val="single" w:sz="4" w:space="0" w:color="000000"/>
+            </w:tcBorders>
+            <w:shd w:val="clear" w:color="auto" w:fill="E7E7E7"/>
+            <w:vAlign w:val="center"/>
+          </w:tcPr>
+          <w:p>
+            <w:pPr>
+              <w:spacing w:before="40" w:after="40" w:line="276" w:lineRule="auto"/>
+              <w:jc w:val="center"/>
+            </w:pPr>
+            <w:r>
+              <w:rPr>
+                <w:rFonts w:eastAsia="Times New Roman" w:cs="Times New Roman"/>
+                <w:b/>
+                <w:bCs/>
+                <w:sz w:val="22"/>
+              </w:rPr>
+              <w:t>Abbreviation</w:t>
+            </w:r>
+          </w:p>
+        </w:tc>
+        <w:tc>
+          <w:tcPr>
+            <w:tcW w:w="5684" w:type="dxa"/>
+            <w:tcBorders>
+              <w:top w:val="single" w:sz="4" w:space="0" w:color="000000"/>
+              <w:left w:val="single" w:sz="4" w:space="0" w:color="000000"/>
+              <w:bottom w:val="single" w:sz="4" w:space="0" w:color="000000"/>
+              <w:right w:val="single" w:sz="4" w:space="0" w:color="000000"/>
+            </w:tcBorders>
+            <w:shd w:val="clear" w:color="auto" w:fill="E7E7E7"/>
+            <w:vAlign w:val="center"/>
+          </w:tcPr>
+          <w:p>
+            <w:pPr>
+              <w:spacing w:before="40" w:after="40" w:line="276" w:lineRule="auto"/>
+              <w:jc w:val="center"/>
+            </w:pPr>
+            <w:r>
+              <w:rPr>
+                <w:rFonts w:eastAsia="Times New Roman" w:cs="Times New Roman"/>
+                <w:b/>
+                <w:bCs/>
+                <w:sz w:val="22"/>
+              </w:rPr>
+              <w:t>Full Form</w:t>
+            </w:r>
           </w:p>
         </w:tc>
       </w:tr>
       <w:tr>
-        <w:tc>
-          <w:tcPr>
-            <w:cnfStyle w:val="001000000000" w:firstRow="0" w:lastRow="0" w:firstColumn="1" w:lastColumn="0" w:oddVBand="0" w:evenVBand="0" w:oddHBand="0" w:evenHBand="0" w:firstRowFirstColumn="0" w:firstRowLastColumn="0" w:lastRowFirstColumn="0" w:lastRowLastColumn="0"/>
-            <w:tcW w:w="4261" w:type="dxa"/>
-          </w:tcPr>
-          <w:p>
-            <w:pPr>
-              <w:spacing w:line="360" w:lineRule="auto"/>
-              <w:jc w:val="both"/>
-              <w:rPr>
-                <w:highlight w:val="lightGray"/>
-              </w:rPr>
-            </w:pPr>
-          </w:p>
-        </w:tc>
-        <w:tc>
-          <w:tcPr>
-            <w:tcW w:w="4261" w:type="dxa"/>
-          </w:tcPr>
-          <w:p>
-            <w:pPr>
-              <w:spacing w:line="360" w:lineRule="auto"/>
-              <w:jc w:val="both"/>
-              <w:cnfStyle w:val="000000000000" w:firstRow="0" w:lastRow="0" w:firstColumn="0" w:lastColumn="0" w:oddVBand="0" w:evenVBand="0" w:oddHBand="0" w:evenHBand="0" w:firstRowFirstColumn="0" w:firstRowLastColumn="0" w:lastRowFirstColumn="0" w:lastRowLastColumn="0"/>
-              <w:rPr>
-                <w:highlight w:val="lightGray"/>
-              </w:rPr>
-            </w:pPr>
+        <w:tblPrEx>
+          <w:tblCellMar>
+            <w:top w:w="0" w:type="dxa"/>
+            <w:bottom w:w="0" w:type="dxa"/>
+          </w:tblCellMar>
+        </w:tblPrEx>
+        <w:trPr>
+          <w:trHeight w:val="500"/>
+        </w:trPr>
+        <w:tc>
+          <w:tcPr>
+            <w:tcW w:w="2588" w:type="dxa"/>
+            <w:tcBorders>
+              <w:top w:val="single" w:sz="4" w:space="0" w:color="000000"/>
+              <w:left w:val="single" w:sz="4" w:space="0" w:color="000000"/>
+              <w:bottom w:val="single" w:sz="4" w:space="0" w:color="000000"/>
+              <w:right w:val="single" w:sz="4" w:space="0" w:color="000000"/>
+            </w:tcBorders>
+            <w:vAlign w:val="center"/>
+          </w:tcPr>
+          <w:p>
+            <w:pPr>
+              <w:spacing w:before="40" w:after="40" w:line="276" w:lineRule="auto"/>
+            </w:pPr>
+            <w:r>
+              <w:rPr>
+                <w:rFonts w:eastAsia="Times New Roman" w:cs="Times New Roman"/>
+                <w:sz w:val="22"/>
+              </w:rPr>
+              <w:t>BCA</w:t>
+            </w:r>
+          </w:p>
+        </w:tc>
+        <w:tc>
+          <w:tcPr>
+            <w:tcW w:w="5684" w:type="dxa"/>
+            <w:tcBorders>
+              <w:top w:val="single" w:sz="4" w:space="0" w:color="000000"/>
+              <w:left w:val="single" w:sz="4" w:space="0" w:color="000000"/>
+              <w:bottom w:val="single" w:sz="4" w:space="0" w:color="000000"/>
+              <w:right w:val="single" w:sz="4" w:space="0" w:color="000000"/>
+            </w:tcBorders>
+            <w:vAlign w:val="center"/>
+          </w:tcPr>
+          <w:p>
+            <w:pPr>
+              <w:spacing w:before="40" w:after="40" w:line="276" w:lineRule="auto"/>
+            </w:pPr>
+            <w:r>
+              <w:rPr>
+                <w:rFonts w:eastAsia="Times New Roman" w:cs="Times New Roman"/>
+                <w:sz w:val="22"/>
+              </w:rPr>
+              <w:t>Bachelor of Computer Application</w:t>
+            </w:r>
           </w:p>
         </w:tc>
       </w:tr>
       <w:tr>
-        <w:tc>
-          <w:tcPr>
-            <w:cnfStyle w:val="001000000000" w:firstRow="0" w:lastRow="0" w:firstColumn="1" w:lastColumn="0" w:oddVBand="0" w:evenVBand="0" w:oddHBand="0" w:evenHBand="0" w:firstRowFirstColumn="0" w:firstRowLastColumn="0" w:lastRowFirstColumn="0" w:lastRowLastColumn="0"/>
-            <w:tcW w:w="4261" w:type="dxa"/>
-          </w:tcPr>
-          <w:p>
-            <w:pPr>
-              <w:spacing w:line="360" w:lineRule="auto"/>
-              <w:jc w:val="both"/>
-              <w:rPr>
-                <w:highlight w:val="lightGray"/>
-              </w:rPr>
-            </w:pPr>
-          </w:p>
-        </w:tc>
-        <w:tc>
-          <w:tcPr>
-            <w:tcW w:w="4261" w:type="dxa"/>
-          </w:tcPr>
-          <w:p>
-            <w:pPr>
-              <w:spacing w:line="360" w:lineRule="auto"/>
-              <w:jc w:val="both"/>
-              <w:cnfStyle w:val="000000000000" w:firstRow="0" w:lastRow="0" w:firstColumn="0" w:lastColumn="0" w:oddVBand="0" w:evenVBand="0" w:oddHBand="0" w:evenHBand="0" w:firstRowFirstColumn="0" w:firstRowLastColumn="0" w:lastRowFirstColumn="0" w:lastRowLastColumn="0"/>
-              <w:rPr>
-                <w:highlight w:val="lightGray"/>
-              </w:rPr>
-            </w:pPr>
+        <w:tblPrEx>
+          <w:tblCellMar>
+            <w:top w:w="0" w:type="dxa"/>
+            <w:bottom w:w="0" w:type="dxa"/>
+          </w:tblCellMar>
+        </w:tblPrEx>
+        <w:trPr>
+          <w:trHeight w:val="517"/>
+        </w:trPr>
+        <w:tc>
+          <w:tcPr>
+            <w:tcW w:w="2588" w:type="dxa"/>
+            <w:tcBorders>
+              <w:top w:val="single" w:sz="4" w:space="0" w:color="000000"/>
+              <w:left w:val="single" w:sz="4" w:space="0" w:color="000000"/>
+              <w:bottom w:val="single" w:sz="4" w:space="0" w:color="000000"/>
+              <w:right w:val="single" w:sz="4" w:space="0" w:color="000000"/>
+            </w:tcBorders>
+            <w:vAlign w:val="center"/>
+          </w:tcPr>
+          <w:p>
+            <w:pPr>
+              <w:spacing w:before="40" w:after="40" w:line="276" w:lineRule="auto"/>
+            </w:pPr>
+            <w:r>
+              <w:rPr>
+                <w:rFonts w:eastAsia="Times New Roman" w:cs="Times New Roman"/>
+                <w:sz w:val="22"/>
+              </w:rPr>
+              <w:t>CLI</w:t>
+            </w:r>
+          </w:p>
+        </w:tc>
+        <w:tc>
+          <w:tcPr>
+            <w:tcW w:w="5684" w:type="dxa"/>
+            <w:tcBorders>
+              <w:top w:val="single" w:sz="4" w:space="0" w:color="000000"/>
+              <w:left w:val="single" w:sz="4" w:space="0" w:color="000000"/>
+              <w:bottom w:val="single" w:sz="4" w:space="0" w:color="000000"/>
+              <w:right w:val="single" w:sz="4" w:space="0" w:color="000000"/>
+            </w:tcBorders>
+            <w:vAlign w:val="center"/>
+          </w:tcPr>
+          <w:p>
+            <w:pPr>
+              <w:spacing w:before="40" w:after="40" w:line="276" w:lineRule="auto"/>
+            </w:pPr>
+            <w:r>
+              <w:rPr>
+                <w:rFonts w:eastAsia="Times New Roman" w:cs="Times New Roman"/>
+                <w:sz w:val="22"/>
+              </w:rPr>
+              <w:t>Command Line Interface</w:t>
+            </w:r>
           </w:p>
         </w:tc>
       </w:tr>
       <w:tr>
-        <w:tc>
-          <w:tcPr>
-            <w:cnfStyle w:val="001000000000" w:firstRow="0" w:lastRow="0" w:firstColumn="1" w:lastColumn="0" w:oddVBand="0" w:evenVBand="0" w:oddHBand="0" w:evenHBand="0" w:firstRowFirstColumn="0" w:firstRowLastColumn="0" w:lastRowFirstColumn="0" w:lastRowLastColumn="0"/>
-            <w:tcW w:w="4261" w:type="dxa"/>
-          </w:tcPr>
-          <w:p>
-            <w:pPr>
-              <w:spacing w:line="360" w:lineRule="auto"/>
-              <w:jc w:val="both"/>
-              <w:rPr>
-                <w:highlight w:val="lightGray"/>
-              </w:rPr>
-            </w:pPr>
-          </w:p>
-        </w:tc>
-        <w:tc>
-          <w:tcPr>
-            <w:tcW w:w="4261" w:type="dxa"/>
-          </w:tcPr>
-          <w:p>
-            <w:pPr>
-              <w:spacing w:line="360" w:lineRule="auto"/>
-              <w:jc w:val="both"/>
-              <w:cnfStyle w:val="000000000000" w:firstRow="0" w:lastRow="0" w:firstColumn="0" w:lastColumn="0" w:oddVBand="0" w:evenVBand="0" w:oddHBand="0" w:evenHBand="0" w:firstRowFirstColumn="0" w:firstRowLastColumn="0" w:lastRowFirstColumn="0" w:lastRowLastColumn="0"/>
-              <w:rPr>
-                <w:highlight w:val="lightGray"/>
-              </w:rPr>
-            </w:pPr>
+        <w:tblPrEx>
+          <w:tblCellMar>
+            <w:top w:w="0" w:type="dxa"/>
+            <w:bottom w:w="0" w:type="dxa"/>
+          </w:tblCellMar>
+        </w:tblPrEx>
+        <w:trPr>
+          <w:trHeight w:val="517"/>
+        </w:trPr>
+        <w:tc>
+          <w:tcPr>
+            <w:tcW w:w="2588" w:type="dxa"/>
+            <w:tcBorders>
+              <w:top w:val="single" w:sz="4" w:space="0" w:color="000000"/>
+              <w:left w:val="single" w:sz="4" w:space="0" w:color="000000"/>
+              <w:bottom w:val="single" w:sz="4" w:space="0" w:color="000000"/>
+              <w:right w:val="single" w:sz="4" w:space="0" w:color="000000"/>
+            </w:tcBorders>
+            <w:vAlign w:val="center"/>
+          </w:tcPr>
+          <w:p>
+            <w:pPr>
+              <w:spacing w:before="40" w:after="40" w:line="276" w:lineRule="auto"/>
+            </w:pPr>
+            <w:r>
+              <w:rPr>
+                <w:rFonts w:eastAsia="Times New Roman" w:cs="Times New Roman"/>
+                <w:sz w:val="22"/>
+              </w:rPr>
+              <w:t>DFD</w:t>
+            </w:r>
+          </w:p>
+        </w:tc>
+        <w:tc>
+          <w:tcPr>
+            <w:tcW w:w="5684" w:type="dxa"/>
+            <w:tcBorders>
+              <w:top w:val="single" w:sz="4" w:space="0" w:color="000000"/>
+              <w:left w:val="single" w:sz="4" w:space="0" w:color="000000"/>
+              <w:bottom w:val="single" w:sz="4" w:space="0" w:color="000000"/>
+              <w:right w:val="single" w:sz="4" w:space="0" w:color="000000"/>
+            </w:tcBorders>
+            <w:vAlign w:val="center"/>
+          </w:tcPr>
+          <w:p>
+            <w:pPr>
+              <w:spacing w:before="40" w:after="40" w:line="276" w:lineRule="auto"/>
+            </w:pPr>
+            <w:r>
+              <w:rPr>
+                <w:rFonts w:eastAsia="Times New Roman" w:cs="Times New Roman"/>
+                <w:sz w:val="22"/>
+              </w:rPr>
+              <w:t>Data Flow Diagram</w:t>
+            </w:r>
           </w:p>
         </w:tc>
       </w:tr>
       <w:tr>
-        <w:tc>
-          <w:tcPr>
-            <w:cnfStyle w:val="001000000000" w:firstRow="0" w:lastRow="0" w:firstColumn="1" w:lastColumn="0" w:oddVBand="0" w:evenVBand="0" w:oddHBand="0" w:evenHBand="0" w:firstRowFirstColumn="0" w:firstRowLastColumn="0" w:lastRowFirstColumn="0" w:lastRowLastColumn="0"/>
-            <w:tcW w:w="4261" w:type="dxa"/>
-          </w:tcPr>
-          <w:p>
-            <w:pPr>
-              <w:spacing w:line="360" w:lineRule="auto"/>
-              <w:jc w:val="both"/>
-              <w:rPr>
-                <w:highlight w:val="lightGray"/>
-              </w:rPr>
-            </w:pPr>
-          </w:p>
-        </w:tc>
-        <w:tc>
-          <w:tcPr>
-            <w:tcW w:w="4261" w:type="dxa"/>
-          </w:tcPr>
-          <w:p>
-            <w:pPr>
-              <w:spacing w:line="360" w:lineRule="auto"/>
-              <w:jc w:val="both"/>
-              <w:cnfStyle w:val="000000000000" w:firstRow="0" w:lastRow="0" w:firstColumn="0" w:lastColumn="0" w:oddVBand="0" w:evenVBand="0" w:oddHBand="0" w:evenHBand="0" w:firstRowFirstColumn="0" w:firstRowLastColumn="0" w:lastRowFirstColumn="0" w:lastRowLastColumn="0"/>
-              <w:rPr>
-                <w:highlight w:val="lightGray"/>
-              </w:rPr>
-            </w:pPr>
-          </w:p>
-        </w:tc>
+        <w:tblPrEx>
+          <w:tblCellMar>
+            <w:top w:w="0" w:type="dxa"/>
+            <w:bottom w:w="0" w:type="dxa"/>
+          </w:tblCellMar>
+        </w:tblPrEx>
+        <w:trPr>
+          <w:trHeight w:val="517"/>
+        </w:trPr>
+        <w:tc>
+          <w:tcPr>
+            <w:tcW w:w="2588" w:type="dxa"/>
+            <w:tcBorders>
+              <w:top w:val="single" w:sz="4" w:space="0" w:color="000000"/>
+              <w:left w:val="single" w:sz="4" w:space="0" w:color="000000"/>
+              <w:bottom w:val="single" w:sz="4" w:space="0" w:color="000000"/>
+              <w:right w:val="single" w:sz="4" w:space="0" w:color="000000"/>
+            </w:tcBorders>
+            <w:vAlign w:val="center"/>
+          </w:tcPr>
+          <w:p>
+            <w:pPr>
+              <w:spacing w:before="40" w:after="40" w:line="276" w:lineRule="auto"/>
+            </w:pPr>
+            <w:r>
+              <w:rPr>
+                <w:rFonts w:eastAsia="Times New Roman" w:cs="Times New Roman"/>
+                <w:sz w:val="22"/>
+              </w:rPr>
+              <w:t>I/O</w:t>
+            </w:r>
+          </w:p>
+        </w:tc>
+        <w:tc>
+          <w:tcPr>
+            <w:tcW w:w="5684" w:type="dxa"/>
+            <w:tcBorders>
+              <w:top w:val="single" w:sz="4" w:space="0" w:color="000000"/>
+              <w:left w:val="single" w:sz="4" w:space="0" w:color="000000"/>
+              <w:bottom w:val="single" w:sz="4" w:space="0" w:color="000000"/>
+              <w:right w:val="single" w:sz="4" w:space="0" w:color="000000"/>
+            </w:tcBorders>
+            <w:vAlign w:val="center"/>
+          </w:tcPr>
+          <w:p>
+            <w:pPr>
+              <w:spacing w:before="40" w:after="40" w:line="276" w:lineRule="auto"/>
+            </w:pPr>
+            <w:r>
+              <w:rPr>
+                <w:rFonts w:eastAsia="Times New Roman" w:cs="Times New Roman"/>
+                <w:sz w:val="22"/>
+              </w:rPr>
+              <w:t>Input / Output</w:t>
+            </w:r>
+          </w:p>
+        </w:tc>
+        <w:bookmarkStart w:id="3" w:name="_GoBack"/>
+        <w:bookmarkEnd w:id="3"/>
       </w:tr>
       <w:tr>
-        <w:tc>
-          <w:tcPr>
-            <w:cnfStyle w:val="001000000000" w:firstRow="0" w:lastRow="0" w:firstColumn="1" w:lastColumn="0" w:oddVBand="0" w:evenVBand="0" w:oddHBand="0" w:evenHBand="0" w:firstRowFirstColumn="0" w:firstRowLastColumn="0" w:lastRowFirstColumn="0" w:lastRowLastColumn="0"/>
-            <w:tcW w:w="4261" w:type="dxa"/>
-          </w:tcPr>
-          <w:p>
-            <w:pPr>
-              <w:spacing w:line="360" w:lineRule="auto"/>
-              <w:jc w:val="both"/>
-              <w:rPr>
-                <w:highlight w:val="lightGray"/>
-              </w:rPr>
-            </w:pPr>
-          </w:p>
-        </w:tc>
-        <w:tc>
-          <w:tcPr>
-            <w:tcW w:w="4261" w:type="dxa"/>
-          </w:tcPr>
-          <w:p>
-            <w:pPr>
-              <w:spacing w:line="360" w:lineRule="auto"/>
-              <w:jc w:val="both"/>
-              <w:cnfStyle w:val="000000000000" w:firstRow="0" w:lastRow="0" w:firstColumn="0" w:lastColumn="0" w:oddVBand="0" w:evenVBand="0" w:oddHBand="0" w:evenHBand="0" w:firstRowFirstColumn="0" w:firstRowLastColumn="0" w:lastRowFirstColumn="0" w:lastRowLastColumn="0"/>
-              <w:rPr>
-                <w:highlight w:val="lightGray"/>
-              </w:rPr>
-            </w:pPr>
+        <w:tblPrEx>
+          <w:tblCellMar>
+            <w:top w:w="0" w:type="dxa"/>
+            <w:bottom w:w="0" w:type="dxa"/>
+          </w:tblCellMar>
+        </w:tblPrEx>
+        <w:trPr>
+          <w:trHeight w:val="500"/>
+        </w:trPr>
+        <w:tc>
+          <w:tcPr>
+            <w:tcW w:w="2588" w:type="dxa"/>
+            <w:tcBorders>
+              <w:top w:val="single" w:sz="4" w:space="0" w:color="000000"/>
+              <w:left w:val="single" w:sz="4" w:space="0" w:color="000000"/>
+              <w:bottom w:val="single" w:sz="4" w:space="0" w:color="000000"/>
+              <w:right w:val="single" w:sz="4" w:space="0" w:color="000000"/>
+            </w:tcBorders>
+            <w:vAlign w:val="center"/>
+          </w:tcPr>
+          <w:p>
+            <w:pPr>
+              <w:spacing w:before="40" w:after="40" w:line="276" w:lineRule="auto"/>
+            </w:pPr>
+            <w:r>
+              <w:rPr>
+                <w:rFonts w:eastAsia="Times New Roman" w:cs="Times New Roman"/>
+                <w:sz w:val="22"/>
+              </w:rPr>
+              <w:t>P.U.</w:t>
+            </w:r>
+          </w:p>
+        </w:tc>
+        <w:tc>
+          <w:tcPr>
+            <w:tcW w:w="5684" w:type="dxa"/>
+            <w:tcBorders>
+              <w:top w:val="single" w:sz="4" w:space="0" w:color="000000"/>
+              <w:left w:val="single" w:sz="4" w:space="0" w:color="000000"/>
+              <w:bottom w:val="single" w:sz="4" w:space="0" w:color="000000"/>
+              <w:right w:val="single" w:sz="4" w:space="0" w:color="000000"/>
+            </w:tcBorders>
+            <w:vAlign w:val="center"/>
+          </w:tcPr>
+          <w:p>
+            <w:pPr>
+              <w:spacing w:before="40" w:after="40" w:line="276" w:lineRule="auto"/>
+            </w:pPr>
+            <w:r>
+              <w:rPr>
+                <w:rFonts w:eastAsia="Times New Roman" w:cs="Times New Roman"/>
+                <w:sz w:val="22"/>
+              </w:rPr>
+              <w:t>Pokhara University</w:t>
+            </w:r>
+          </w:p>
+        </w:tc>
+      </w:tr>
+      <w:tr>
+        <w:tblPrEx>
+          <w:tblCellMar>
+            <w:top w:w="0" w:type="dxa"/>
+            <w:bottom w:w="0" w:type="dxa"/>
+          </w:tblCellMar>
+        </w:tblPrEx>
+        <w:trPr>
+          <w:trHeight w:val="517"/>
+        </w:trPr>
+        <w:tc>
+          <w:tcPr>
+            <w:tcW w:w="2588" w:type="dxa"/>
+            <w:tcBorders>
+              <w:top w:val="single" w:sz="4" w:space="0" w:color="000000"/>
+              <w:left w:val="single" w:sz="4" w:space="0" w:color="000000"/>
+              <w:bottom w:val="single" w:sz="4" w:space="0" w:color="000000"/>
+              <w:right w:val="single" w:sz="4" w:space="0" w:color="000000"/>
+            </w:tcBorders>
+            <w:vAlign w:val="center"/>
+          </w:tcPr>
+          <w:p>
+            <w:pPr>
+              <w:spacing w:before="40" w:after="40" w:line="276" w:lineRule="auto"/>
+            </w:pPr>
+            <w:r>
+              <w:rPr>
+                <w:rFonts w:eastAsia="Times New Roman" w:cs="Times New Roman"/>
+                <w:sz w:val="22"/>
+              </w:rPr>
+              <w:t>RTM</w:t>
+            </w:r>
+          </w:p>
+        </w:tc>
+        <w:tc>
+          <w:tcPr>
+            <w:tcW w:w="5684" w:type="dxa"/>
+            <w:tcBorders>
+              <w:top w:val="single" w:sz="4" w:space="0" w:color="000000"/>
+              <w:left w:val="single" w:sz="4" w:space="0" w:color="000000"/>
+              <w:bottom w:val="single" w:sz="4" w:space="0" w:color="000000"/>
+              <w:right w:val="single" w:sz="4" w:space="0" w:color="000000"/>
+            </w:tcBorders>
+            <w:vAlign w:val="center"/>
+          </w:tcPr>
+          <w:p>
+            <w:pPr>
+              <w:spacing w:before="40" w:after="40" w:line="276" w:lineRule="auto"/>
+            </w:pPr>
+            <w:r>
+              <w:rPr>
+                <w:rFonts w:eastAsia="Times New Roman" w:cs="Times New Roman"/>
+                <w:sz w:val="22"/>
+              </w:rPr>
+              <w:t>Requirement Traceability Matrix</w:t>
+            </w:r>
+          </w:p>
+        </w:tc>
+      </w:tr>
+      <w:tr>
+        <w:tblPrEx>
+          <w:tblCellMar>
+            <w:top w:w="0" w:type="dxa"/>
+            <w:bottom w:w="0" w:type="dxa"/>
+          </w:tblCellMar>
+        </w:tblPrEx>
+        <w:trPr>
+          <w:trHeight w:val="517"/>
+        </w:trPr>
+        <w:tc>
+          <w:tcPr>
+            <w:tcW w:w="2588" w:type="dxa"/>
+            <w:tcBorders>
+              <w:top w:val="single" w:sz="4" w:space="0" w:color="000000"/>
+              <w:left w:val="single" w:sz="4" w:space="0" w:color="000000"/>
+              <w:bottom w:val="single" w:sz="4" w:space="0" w:color="000000"/>
+              <w:right w:val="single" w:sz="4" w:space="0" w:color="000000"/>
+            </w:tcBorders>
+            <w:vAlign w:val="center"/>
+          </w:tcPr>
+          <w:p>
+            <w:pPr>
+              <w:spacing w:before="40" w:after="40" w:line="276" w:lineRule="auto"/>
+            </w:pPr>
+            <w:r>
+              <w:rPr>
+                <w:rFonts w:eastAsia="Times New Roman" w:cs="Times New Roman"/>
+                <w:sz w:val="22"/>
+              </w:rPr>
+              <w:t>SDLC</w:t>
+            </w:r>
+          </w:p>
+        </w:tc>
+        <w:tc>
+          <w:tcPr>
+            <w:tcW w:w="5684" w:type="dxa"/>
+            <w:tcBorders>
+              <w:top w:val="single" w:sz="4" w:space="0" w:color="000000"/>
+              <w:left w:val="single" w:sz="4" w:space="0" w:color="000000"/>
+              <w:bottom w:val="single" w:sz="4" w:space="0" w:color="000000"/>
+              <w:right w:val="single" w:sz="4" w:space="0" w:color="000000"/>
+            </w:tcBorders>
+            <w:vAlign w:val="center"/>
+          </w:tcPr>
+          <w:p>
+            <w:pPr>
+              <w:spacing w:before="40" w:after="40" w:line="276" w:lineRule="auto"/>
+            </w:pPr>
+            <w:r>
+              <w:rPr>
+                <w:rFonts w:eastAsia="Times New Roman" w:cs="Times New Roman"/>
+                <w:sz w:val="22"/>
+              </w:rPr>
+              <w:t>Software Development Life Cycle</w:t>
+            </w:r>
+          </w:p>
+        </w:tc>
+      </w:tr>
+      <w:tr>
+        <w:tblPrEx>
+          <w:tblCellMar>
+            <w:top w:w="0" w:type="dxa"/>
+            <w:bottom w:w="0" w:type="dxa"/>
+          </w:tblCellMar>
+        </w:tblPrEx>
+        <w:trPr>
+          <w:trHeight w:val="517"/>
+        </w:trPr>
+        <w:tc>
+          <w:tcPr>
+            <w:tcW w:w="2588" w:type="dxa"/>
+            <w:tcBorders>
+              <w:top w:val="single" w:sz="4" w:space="0" w:color="000000"/>
+              <w:left w:val="single" w:sz="4" w:space="0" w:color="000000"/>
+              <w:bottom w:val="single" w:sz="4" w:space="0" w:color="000000"/>
+              <w:right w:val="single" w:sz="4" w:space="0" w:color="000000"/>
+            </w:tcBorders>
+            <w:vAlign w:val="center"/>
+          </w:tcPr>
+          <w:p>
+            <w:pPr>
+              <w:spacing w:before="40" w:after="40" w:line="276" w:lineRule="auto"/>
+            </w:pPr>
+            <w:r>
+              <w:rPr>
+                <w:rFonts w:eastAsia="Times New Roman" w:cs="Times New Roman"/>
+                <w:sz w:val="22"/>
+              </w:rPr>
+              <w:t>SRD</w:t>
+            </w:r>
+          </w:p>
+        </w:tc>
+        <w:tc>
+          <w:tcPr>
+            <w:tcW w:w="5684" w:type="dxa"/>
+            <w:tcBorders>
+              <w:top w:val="single" w:sz="4" w:space="0" w:color="000000"/>
+              <w:left w:val="single" w:sz="4" w:space="0" w:color="000000"/>
+              <w:bottom w:val="single" w:sz="4" w:space="0" w:color="000000"/>
+              <w:right w:val="single" w:sz="4" w:space="0" w:color="000000"/>
+            </w:tcBorders>
+            <w:vAlign w:val="center"/>
+          </w:tcPr>
+          <w:p>
+            <w:pPr>
+              <w:spacing w:before="40" w:after="40" w:line="276" w:lineRule="auto"/>
+            </w:pPr>
+            <w:r>
+              <w:rPr>
+                <w:rFonts w:eastAsia="Times New Roman" w:cs="Times New Roman"/>
+                <w:sz w:val="22"/>
+              </w:rPr>
+              <w:t>Software Requirement Document</w:t>
+            </w:r>
+          </w:p>
+        </w:tc>
+      </w:tr>
+      <w:tr>
+        <w:tblPrEx>
+          <w:tblCellMar>
+            <w:top w:w="0" w:type="dxa"/>
+            <w:bottom w:w="0" w:type="dxa"/>
+          </w:tblCellMar>
+        </w:tblPrEx>
+        <w:trPr>
+          <w:trHeight w:val="500"/>
+        </w:trPr>
+        <w:tc>
+          <w:tcPr>
+            <w:tcW w:w="2588" w:type="dxa"/>
+            <w:tcBorders>
+              <w:top w:val="single" w:sz="4" w:space="0" w:color="000000"/>
+              <w:left w:val="single" w:sz="4" w:space="0" w:color="000000"/>
+              <w:bottom w:val="single" w:sz="4" w:space="0" w:color="000000"/>
+              <w:right w:val="single" w:sz="4" w:space="0" w:color="000000"/>
+            </w:tcBorders>
+            <w:vAlign w:val="center"/>
+          </w:tcPr>
+          <w:p>
+            <w:pPr>
+              <w:spacing w:before="40" w:after="40" w:line="276" w:lineRule="auto"/>
+            </w:pPr>
+            <w:r>
+              <w:rPr>
+                <w:rFonts w:eastAsia="Times New Roman" w:cs="Times New Roman"/>
+                <w:sz w:val="22"/>
+              </w:rPr>
+              <w:t>STLC</w:t>
+            </w:r>
+          </w:p>
+        </w:tc>
+        <w:tc>
+          <w:tcPr>
+            <w:tcW w:w="5684" w:type="dxa"/>
+            <w:tcBorders>
+              <w:top w:val="single" w:sz="4" w:space="0" w:color="000000"/>
+              <w:left w:val="single" w:sz="4" w:space="0" w:color="000000"/>
+              <w:bottom w:val="single" w:sz="4" w:space="0" w:color="000000"/>
+              <w:right w:val="single" w:sz="4" w:space="0" w:color="000000"/>
+            </w:tcBorders>
+            <w:vAlign w:val="center"/>
+          </w:tcPr>
+          <w:p>
+            <w:pPr>
+              <w:spacing w:before="40" w:after="40" w:line="276" w:lineRule="auto"/>
+            </w:pPr>
+            <w:r>
+              <w:rPr>
+                <w:rFonts w:eastAsia="Times New Roman" w:cs="Times New Roman"/>
+                <w:sz w:val="22"/>
+              </w:rPr>
+              <w:t>Software Testing Life Cycle</w:t>
+            </w:r>
+          </w:p>
+        </w:tc>
+      </w:tr>
+      <w:tr>
+        <w:tblPrEx>
+          <w:tblCellMar>
+            <w:top w:w="0" w:type="dxa"/>
+            <w:bottom w:w="0" w:type="dxa"/>
+          </w:tblCellMar>
+        </w:tblPrEx>
+        <w:trPr>
+          <w:trHeight w:val="517"/>
+        </w:trPr>
+        <w:tc>
+          <w:tcPr>
+            <w:tcW w:w="2588" w:type="dxa"/>
+            <w:tcBorders>
+              <w:top w:val="single" w:sz="4" w:space="0" w:color="000000"/>
+              <w:left w:val="single" w:sz="4" w:space="0" w:color="000000"/>
+              <w:bottom w:val="single" w:sz="4" w:space="0" w:color="000000"/>
+              <w:right w:val="single" w:sz="4" w:space="0" w:color="000000"/>
+            </w:tcBorders>
+            <w:vAlign w:val="center"/>
+          </w:tcPr>
+          <w:p>
+            <w:pPr>
+              <w:spacing w:before="40" w:after="40" w:line="276" w:lineRule="auto"/>
+            </w:pPr>
+            <w:r>
+              <w:rPr>
+                <w:rFonts w:eastAsia="Times New Roman" w:cs="Times New Roman"/>
+                <w:sz w:val="22"/>
+              </w:rPr>
+              <w:t>TID</w:t>
+            </w:r>
+          </w:p>
+        </w:tc>
+        <w:tc>
+          <w:tcPr>
+            <w:tcW w:w="5684" w:type="dxa"/>
+            <w:tcBorders>
+              <w:top w:val="single" w:sz="4" w:space="0" w:color="000000"/>
+              <w:left w:val="single" w:sz="4" w:space="0" w:color="000000"/>
+              <w:bottom w:val="single" w:sz="4" w:space="0" w:color="000000"/>
+              <w:right w:val="single" w:sz="4" w:space="0" w:color="000000"/>
+            </w:tcBorders>
+            <w:vAlign w:val="center"/>
+          </w:tcPr>
+          <w:p>
+            <w:pPr>
+              <w:spacing w:before="40" w:after="40" w:line="276" w:lineRule="auto"/>
+            </w:pPr>
+            <w:r>
+              <w:rPr>
+                <w:rFonts w:eastAsia="Times New Roman" w:cs="Times New Roman"/>
+                <w:sz w:val="22"/>
+              </w:rPr>
+              <w:t>Test Case Identifier</w:t>
+            </w:r>
+          </w:p>
+        </w:tc>
+      </w:tr>
+      <w:tr>
+        <w:tblPrEx>
+          <w:tblCellMar>
+            <w:top w:w="0" w:type="dxa"/>
+            <w:bottom w:w="0" w:type="dxa"/>
+          </w:tblCellMar>
+        </w:tblPrEx>
+        <w:trPr>
+          <w:trHeight w:val="517"/>
+        </w:trPr>
+        <w:tc>
+          <w:tcPr>
+            <w:tcW w:w="2588" w:type="dxa"/>
+            <w:tcBorders>
+              <w:top w:val="single" w:sz="4" w:space="0" w:color="000000"/>
+              <w:left w:val="single" w:sz="4" w:space="0" w:color="000000"/>
+              <w:bottom w:val="single" w:sz="4" w:space="0" w:color="000000"/>
+              <w:right w:val="single" w:sz="4" w:space="0" w:color="000000"/>
+            </w:tcBorders>
+            <w:vAlign w:val="center"/>
+          </w:tcPr>
+          <w:p>
+            <w:pPr>
+              <w:spacing w:before="40" w:after="40" w:line="276" w:lineRule="auto"/>
+            </w:pPr>
+            <w:r>
+              <w:rPr>
+                <w:rFonts w:eastAsia="Times New Roman" w:cs="Times New Roman"/>
+                <w:sz w:val="22"/>
+              </w:rPr>
+              <w:t>UAT</w:t>
+            </w:r>
+          </w:p>
+        </w:tc>
+        <w:tc>
+          <w:tcPr>
+            <w:tcW w:w="5684" w:type="dxa"/>
+            <w:tcBorders>
+              <w:top w:val="single" w:sz="4" w:space="0" w:color="000000"/>
+              <w:left w:val="single" w:sz="4" w:space="0" w:color="000000"/>
+              <w:bottom w:val="single" w:sz="4" w:space="0" w:color="000000"/>
+              <w:right w:val="single" w:sz="4" w:space="0" w:color="000000"/>
+            </w:tcBorders>
+            <w:vAlign w:val="center"/>
+          </w:tcPr>
+          <w:p>
+            <w:pPr>
+              <w:spacing w:before="40" w:after="40" w:line="276" w:lineRule="auto"/>
+            </w:pPr>
+            <w:r>
+              <w:rPr>
+                <w:rFonts w:eastAsia="Times New Roman" w:cs="Times New Roman"/>
+                <w:sz w:val="22"/>
+              </w:rPr>
+              <w:t>User Acceptance Testing</w:t>
+            </w:r>
           </w:p>
         </w:tc>
       </w:tr>
@@ -5503,14 +6037,14 @@
         <w:pStyle w:val="Heading1"/>
         <w:spacing w:line="360" w:lineRule="auto"/>
       </w:pPr>
-      <w:bookmarkStart w:id="3" w:name="_Toc234473276"/>
-      <w:bookmarkStart w:id="4" w:name="_Toc234481639"/>
+      <w:bookmarkStart w:id="4" w:name="_Toc234473276"/>
+      <w:bookmarkStart w:id="5" w:name="_Toc234481639"/>
       <w:r>
         <w:lastRenderedPageBreak/>
         <w:t>Introduction</w:t>
       </w:r>
-      <w:bookmarkEnd w:id="3"/>
       <w:bookmarkEnd w:id="4"/>
+      <w:bookmarkEnd w:id="5"/>
     </w:p>
     <w:p>
       <w:pPr>
@@ -5671,8 +6205,8 @@
         <w:spacing w:line="360" w:lineRule="auto"/>
         <w:jc w:val="both"/>
       </w:pPr>
-      <w:bookmarkStart w:id="5" w:name="_Toc234473277"/>
-      <w:bookmarkStart w:id="6" w:name="_Toc234481640"/>
+      <w:bookmarkStart w:id="6" w:name="_Toc234473277"/>
+      <w:bookmarkStart w:id="7" w:name="_Toc234481640"/>
       <w:r>
         <w:lastRenderedPageBreak/>
         <w:t>P</w:t>
@@ -5686,8 +6220,8 @@
       <w:r>
         <w:t>tatement</w:t>
       </w:r>
-      <w:bookmarkEnd w:id="5"/>
       <w:bookmarkEnd w:id="6"/>
+      <w:bookmarkEnd w:id="7"/>
     </w:p>
     <w:p>
       <w:pPr>
@@ -5804,14 +6338,14 @@
       <w:pPr>
         <w:pStyle w:val="Heading1"/>
       </w:pPr>
-      <w:bookmarkStart w:id="7" w:name="_Toc234473278"/>
-      <w:bookmarkStart w:id="8" w:name="_Toc234481641"/>
+      <w:bookmarkStart w:id="8" w:name="_Toc234473278"/>
+      <w:bookmarkStart w:id="9" w:name="_Toc234481641"/>
       <w:r>
         <w:lastRenderedPageBreak/>
         <w:t>Objectives</w:t>
       </w:r>
-      <w:bookmarkEnd w:id="7"/>
       <w:bookmarkEnd w:id="8"/>
+      <w:bookmarkEnd w:id="9"/>
     </w:p>
     <w:p>
       <w:pPr>
@@ -6034,14 +6568,14 @@
         <w:spacing w:line="360" w:lineRule="auto"/>
         <w:jc w:val="both"/>
       </w:pPr>
-      <w:bookmarkStart w:id="9" w:name="_Toc234473279"/>
-      <w:bookmarkStart w:id="10" w:name="_Toc234481642"/>
+      <w:bookmarkStart w:id="10" w:name="_Toc234473279"/>
+      <w:bookmarkStart w:id="11" w:name="_Toc234481642"/>
       <w:r>
         <w:lastRenderedPageBreak/>
         <w:t>Background Study</w:t>
       </w:r>
-      <w:bookmarkEnd w:id="9"/>
       <w:bookmarkEnd w:id="10"/>
+      <w:bookmarkEnd w:id="11"/>
     </w:p>
     <w:p>
       <w:pPr>
@@ -6104,14 +6638,14 @@
       <w:pPr>
         <w:pStyle w:val="Heading1"/>
       </w:pPr>
-      <w:bookmarkStart w:id="11" w:name="_Toc234473280"/>
-      <w:bookmarkStart w:id="12" w:name="_Toc234481643"/>
+      <w:bookmarkStart w:id="12" w:name="_Toc234473280"/>
+      <w:bookmarkStart w:id="13" w:name="_Toc234481643"/>
       <w:r>
         <w:lastRenderedPageBreak/>
         <w:t>Requirement Document</w:t>
       </w:r>
-      <w:bookmarkEnd w:id="11"/>
       <w:bookmarkEnd w:id="12"/>
+      <w:bookmarkEnd w:id="13"/>
     </w:p>
     <w:p>
       <w:pPr>
@@ -6254,7 +6788,7 @@
           <w:rFonts w:eastAsia="Times New Roman" w:cs="Times New Roman"/>
         </w:rPr>
       </w:pPr>
-      <w:bookmarkStart w:id="13" w:name="_Toc234481644"/>
+      <w:bookmarkStart w:id="14" w:name="_Toc234481644"/>
       <w:r>
         <w:rPr>
           <w:rStyle w:val="Heading2Char"/>
@@ -6265,7 +6799,7 @@
         </w:rPr>
         <w:t>Types of Requirements</w:t>
       </w:r>
-      <w:bookmarkEnd w:id="13"/>
+      <w:bookmarkEnd w:id="14"/>
     </w:p>
     <w:p>
       <w:pPr>
@@ -6287,7 +6821,7 @@
           </w14:textOutline>
         </w:rPr>
       </w:pPr>
-      <w:bookmarkStart w:id="14" w:name="_Toc234481645"/>
+      <w:bookmarkStart w:id="15" w:name="_Toc234481645"/>
       <w:r>
         <w:rPr>
           <w:b/>
@@ -6305,7 +6839,7 @@
         </w:rPr>
         <w:t>Business Requirements</w:t>
       </w:r>
-      <w:bookmarkEnd w:id="14"/>
+      <w:bookmarkEnd w:id="15"/>
     </w:p>
     <w:p>
       <w:pPr>
@@ -6333,7 +6867,7 @@
           <w:color w:val="000000" w:themeColor="text1"/>
         </w:rPr>
       </w:pPr>
-      <w:bookmarkStart w:id="15" w:name="_Toc234481646"/>
+      <w:bookmarkStart w:id="16" w:name="_Toc234481646"/>
       <w:r>
         <w:rPr>
           <w:b/>
@@ -6341,7 +6875,7 @@
         </w:rPr>
         <w:t>User Requirements</w:t>
       </w:r>
-      <w:bookmarkEnd w:id="15"/>
+      <w:bookmarkEnd w:id="16"/>
     </w:p>
     <w:p>
       <w:pPr>
@@ -6388,7 +6922,7 @@
           </w14:textOutline>
         </w:rPr>
       </w:pPr>
-      <w:bookmarkStart w:id="16" w:name="_Toc234481647"/>
+      <w:bookmarkStart w:id="17" w:name="_Toc234481647"/>
       <w:r>
         <w:rPr>
           <w:rFonts w:ascii="Times New Roman" w:hAnsi="Times New Roman" w:cs="Times New Roman"/>
@@ -6406,7 +6940,7 @@
         </w:rPr>
         <w:t>Functional Requirements</w:t>
       </w:r>
-      <w:bookmarkEnd w:id="16"/>
+      <w:bookmarkEnd w:id="17"/>
     </w:p>
     <w:p>
       <w:pPr>
@@ -6441,7 +6975,7 @@
           <w:color w:val="auto"/>
         </w:rPr>
       </w:pPr>
-      <w:bookmarkStart w:id="17" w:name="_Toc234481648"/>
+      <w:bookmarkStart w:id="18" w:name="_Toc234481648"/>
       <w:r>
         <w:rPr>
           <w:b/>
@@ -6449,7 +6983,7 @@
         </w:rPr>
         <w:t>Non-Functional Requirements</w:t>
       </w:r>
-      <w:bookmarkEnd w:id="17"/>
+      <w:bookmarkEnd w:id="18"/>
     </w:p>
     <w:p>
       <w:pPr>
@@ -6473,13 +7007,13 @@
         <w:spacing w:line="360" w:lineRule="auto"/>
         <w:jc w:val="both"/>
       </w:pPr>
-      <w:bookmarkStart w:id="18" w:name="_Toc234473281"/>
-      <w:bookmarkStart w:id="19" w:name="_Toc234481649"/>
+      <w:bookmarkStart w:id="19" w:name="_Toc234473281"/>
+      <w:bookmarkStart w:id="20" w:name="_Toc234481649"/>
       <w:r>
         <w:t>Requirement Matrix:</w:t>
       </w:r>
-      <w:bookmarkEnd w:id="18"/>
       <w:bookmarkEnd w:id="19"/>
+      <w:bookmarkEnd w:id="20"/>
     </w:p>
     <w:p>
       <w:pPr>
@@ -7582,7 +8116,7 @@
           <w:szCs w:val="24"/>
         </w:rPr>
       </w:pPr>
-      <w:bookmarkStart w:id="20" w:name="_Toc234482380"/>
+      <w:bookmarkStart w:id="21" w:name="_Toc234482380"/>
       <w:r>
         <w:rPr>
           <w:sz w:val="24"/>
@@ -7633,7 +8167,7 @@
         </w:rPr>
         <w:t>:Requirement Matrix</w:t>
       </w:r>
-      <w:bookmarkEnd w:id="20"/>
+      <w:bookmarkEnd w:id="21"/>
     </w:p>
     <w:p>
       <w:pPr>
@@ -7657,14 +8191,14 @@
       <w:pPr>
         <w:pStyle w:val="Heading1"/>
       </w:pPr>
-      <w:bookmarkStart w:id="21" w:name="_Toc234473282"/>
-      <w:bookmarkStart w:id="22" w:name="_Toc234481650"/>
+      <w:bookmarkStart w:id="22" w:name="_Toc234473282"/>
+      <w:bookmarkStart w:id="23" w:name="_Toc234481650"/>
       <w:r>
         <w:lastRenderedPageBreak/>
         <w:t>System Design</w:t>
       </w:r>
-      <w:bookmarkEnd w:id="21"/>
       <w:bookmarkEnd w:id="22"/>
+      <w:bookmarkEnd w:id="23"/>
     </w:p>
     <w:p>
       <w:pPr>
@@ -7806,7 +8340,7 @@
         <w:spacing w:line="360" w:lineRule="auto"/>
         <w:jc w:val="both"/>
       </w:pPr>
-      <w:bookmarkStart w:id="23" w:name="_Toc234481651"/>
+      <w:bookmarkStart w:id="24" w:name="_Toc234481651"/>
       <w:r>
         <w:lastRenderedPageBreak/>
         <w:t>Use Case Diagram</w:t>
@@ -7982,14 +8516,19 @@
     <w:p>
       <w:pPr>
         <w:pStyle w:val="Heading2"/>
+        <w:spacing w:line="360" w:lineRule="auto"/>
       </w:pPr>
       <w:r>
         <w:lastRenderedPageBreak/>
         <w:t>Data Flow Diagram</w:t>
       </w:r>
-      <w:bookmarkEnd w:id="23"/>
-    </w:p>
-    <w:p>
+      <w:bookmarkEnd w:id="24"/>
+    </w:p>
+    <w:p>
+      <w:pPr>
+        <w:spacing w:line="360" w:lineRule="auto"/>
+        <w:jc w:val="both"/>
+      </w:pPr>
       <w:r>
         <w:t xml:space="preserve">A </w:t>
       </w:r>
@@ -8011,91 +8550,94 @@
         <w:t>Context Diagram</w:t>
       </w:r>
       <w:r>
-        <w:t>, provides a high-level overview of the entire system by representing it as a single process. It illustrates the interaction between the system and external entities through data flows but does not show any internal processes or data stores.</w:t>
-      </w:r>
-      <w:r>
-        <w:br/>
-      </w:r>
-      <w:r>
-        <w:br/>
-      </w:r>
-      <w:bookmarkStart w:id="24" w:name="_GoBack"/>
-      <w:bookmarkEnd w:id="24"/>
-    </w:p>
-    <w:p>
-      <w:pPr>
-        <w:pStyle w:val="Heading2"/>
-      </w:pPr>
-      <w:bookmarkStart w:id="25" w:name="_Toc234481652"/>
-      <w:r>
-        <w:t>Flowchart</w:t>
-      </w:r>
-      <w:bookmarkEnd w:id="25"/>
-    </w:p>
-    <w:p>
-      <w:pPr>
-        <w:pStyle w:val="ListParagraph"/>
-        <w:spacing w:after="0" w:line="360" w:lineRule="auto"/>
-        <w:jc w:val="both"/>
-      </w:pPr>
-      <w:r>
-        <w:t xml:space="preserve">Make sure, the flowchart encompasses all the components of the </w:t>
-      </w:r>
-      <w:r>
-        <w:t>project</w:t>
-      </w:r>
-      <w:r>
-        <w:rPr>
-          <w:color w:val="FF0000"/>
-        </w:rPr>
-        <w:t xml:space="preserve">, the best approach would be creating flow chart for the CRUD operations </w:t>
-      </w:r>
-      <w:r>
-        <w:t>what you use for the data-entry, data selection, data modification and deletion.</w:t>
-      </w:r>
-    </w:p>
-    <w:p>
-      <w:pPr>
-        <w:pStyle w:val="ListParagraph"/>
-        <w:spacing w:after="0" w:line="360" w:lineRule="auto"/>
-        <w:jc w:val="both"/>
+        <w:t>, provides a high-level overview of the entire system by representing it as a single process. It illustrates the interaction between the system and external entities through data flows but does not show any internal processes or data stores</w:t>
+      </w:r>
+    </w:p>
+    <w:p/>
+    <w:p/>
+    <w:p/>
+    <w:p/>
+    <w:p/>
+    <w:p/>
+    <w:p/>
+    <w:p/>
+    <w:p/>
+    <w:p/>
+    <w:p/>
+    <w:p/>
+    <w:p/>
+    <w:p/>
+    <w:p/>
+    <w:p/>
+    <w:p/>
+    <w:p/>
+    <w:p/>
+    <w:p/>
+    <w:p/>
+    <w:p/>
+    <w:p/>
+    <w:p/>
+    <w:p/>
+    <w:p>
+      <w:pPr>
+        <w:spacing w:line="360" w:lineRule="auto"/>
+        <w:jc w:val="both"/>
+      </w:pPr>
+      <w:r>
+        <w:lastRenderedPageBreak/>
+        <w:t xml:space="preserve">A </w:t>
+      </w:r>
+      <w:r>
+        <w:rPr>
+          <w:rStyle w:val="Strong"/>
+          <w:b w:val="0"/>
+        </w:rPr>
+        <w:t>Level 1 Data Flow Diagram (DFD)</w:t>
+      </w:r>
+      <w:r>
+        <w:rPr>
+          <w:b/>
+        </w:rPr>
+        <w:t xml:space="preserve"> </w:t>
+      </w:r>
+      <w:r>
+        <w:t>is a more detailed version of a Level 0 DFD. It breaks down the main processes shown in the Level 0 diagram into smaller sub-processes, illustrating how data moves between processes, data stores, and external entities. A Level 1 DFD provides a clearer understanding of the system's internal operations while maintaining the same overall inputs and outputs as the Level 0 DFD.</w:t>
+      </w:r>
+    </w:p>
+    <w:p/>
+    <w:p>
+      <w:pPr>
+        <w:keepNext/>
+        <w:jc w:val="center"/>
       </w:pPr>
       <w:r>
         <w:rPr>
           <w:noProof/>
-          <w:lang w:val="en-US"/>
         </w:rPr>
         <w:drawing>
-          <wp:inline distT="0" distB="0" distL="0" distR="0" wp14:anchorId="23DD7EC3" wp14:editId="723BBC67">
-            <wp:extent cx="4274794" cy="5438774"/>
+          <wp:inline distT="0" distB="0" distL="0" distR="0" wp14:anchorId="65B8103E" wp14:editId="615401A0">
+            <wp:extent cx="4572000" cy="5543550"/>
             <wp:effectExtent l="0" t="0" r="0" b="0"/>
-            <wp:docPr id="7" name="Picture 7" descr="Standard Flowchart Symbols. | Download Scientific Diagram"/>
-            <wp:cNvGraphicFramePr>
-              <a:graphicFrameLocks xmlns:a="http://schemas.openxmlformats.org/drawingml/2006/main" noChangeAspect="1"/>
-            </wp:cNvGraphicFramePr>
+            <wp:docPr id="10" name="Picture 10"/>
+            <wp:cNvGraphicFramePr/>
             <a:graphic xmlns:a="http://schemas.openxmlformats.org/drawingml/2006/main">
               <a:graphicData uri="http://schemas.openxmlformats.org/drawingml/2006/picture">
                 <pic:pic xmlns:pic="http://schemas.openxmlformats.org/drawingml/2006/picture">
                   <pic:nvPicPr>
-                    <pic:cNvPr id="0" name="Picture 7"/>
+                    <pic:cNvPr id="1" name="Picture 1"/>
                     <pic:cNvPicPr/>
                   </pic:nvPicPr>
                   <pic:blipFill>
-                    <a:blip r:embed="rId15">
-                      <a:extLst>
-                        <a:ext uri="{28A0092B-C50C-407E-A947-70E740481C1C}">
-                          <a14:useLocalDpi xmlns:a14="http://schemas.microsoft.com/office/drawing/2010/main" val="0"/>
-                        </a:ext>
-                      </a:extLst>
-                    </a:blip>
+                    <a:blip r:embed="rId15"/>
+                    <a:srcRect/>
                     <a:stretch>
                       <a:fillRect/>
                     </a:stretch>
                   </pic:blipFill>
-                  <pic:spPr>
+                  <pic:spPr bwMode="auto">
                     <a:xfrm>
                       <a:off x="0" y="0"/>
-                      <a:ext cx="4274794" cy="5438774"/>
+                      <a:ext cx="4572000" cy="5543550"/>
                     </a:xfrm>
                     <a:prstGeom prst="rect">
                       <a:avLst/>
@@ -8110,12 +8652,78 @@
     </w:p>
     <w:p>
       <w:pPr>
+        <w:pStyle w:val="Caption"/>
+        <w:spacing w:line="360" w:lineRule="auto"/>
+        <w:jc w:val="center"/>
+      </w:pPr>
+      <w:r>
+        <w:t xml:space="preserve">Figure </w:t>
+      </w:r>
+      <w:r>
+        <w:fldChar w:fldCharType="begin"/>
+      </w:r>
+      <w:r>
+        <w:instrText xml:space="preserve"> SEQ Figure \* ARABIC </w:instrText>
+      </w:r>
+      <w:r>
+        <w:fldChar w:fldCharType="separate"/>
+      </w:r>
+      <w:r>
+        <w:rPr>
+          <w:noProof/>
+        </w:rPr>
+        <w:t>3</w:t>
+      </w:r>
+      <w:r>
+        <w:fldChar w:fldCharType="end"/>
+      </w:r>
+      <w:r>
+        <w:t>: Data Flow Diagram Level 1</w:t>
+      </w:r>
+    </w:p>
+    <w:p/>
+    <w:p/>
+    <w:p/>
+    <w:p/>
+    <w:p>
+      <w:pPr>
+        <w:pStyle w:val="Heading2"/>
+        <w:spacing w:line="360" w:lineRule="auto"/>
+        <w:jc w:val="both"/>
+      </w:pPr>
+      <w:bookmarkStart w:id="25" w:name="_Toc234481652"/>
+      <w:r>
+        <w:lastRenderedPageBreak/>
+        <w:t>Flowchart</w:t>
+      </w:r>
+      <w:bookmarkEnd w:id="25"/>
+    </w:p>
+    <w:p>
+      <w:pPr>
         <w:pStyle w:val="ListParagraph"/>
         <w:spacing w:after="0" w:line="360" w:lineRule="auto"/>
-        <w:jc w:val="both"/>
-      </w:pPr>
-      <w:r>
-        <w:t>Try to use all the symbols properly, it is quite easy once you get a hang of it.</w:t>
+        <w:ind w:left="0"/>
+        <w:jc w:val="both"/>
+      </w:pPr>
+      <w:r>
+        <w:t xml:space="preserve">A </w:t>
+      </w:r>
+      <w:r>
+        <w:rPr>
+          <w:rStyle w:val="Strong"/>
+        </w:rPr>
+        <w:t>flowchart</w:t>
+      </w:r>
+      <w:r>
+        <w:t xml:space="preserve"> is a graphical representation of a process, algorithm, or workflow using standardized symbols connected by arrows. It illustrates the sequence of steps, decisions, inputs, and outputs, making it easier to understand, </w:t>
+      </w:r>
+      <w:proofErr w:type="spellStart"/>
+      <w:r>
+        <w:t>analyze</w:t>
+      </w:r>
+      <w:proofErr w:type="spellEnd"/>
+      <w:r>
+        <w:t>, and communicate how a system or process operates.</w:t>
       </w:r>
     </w:p>
     <w:p>
@@ -8316,18 +8924,12 @@
     </w:p>
     <w:p>
       <w:pPr>
-        <w:pStyle w:val="ListParagraph"/>
-        <w:spacing w:after="0" w:line="360" w:lineRule="auto"/>
-        <w:jc w:val="both"/>
-      </w:pPr>
-    </w:p>
-    <w:p>
-      <w:pPr>
         <w:pStyle w:val="Heading1"/>
       </w:pPr>
       <w:bookmarkStart w:id="26" w:name="_Toc234473283"/>
       <w:bookmarkStart w:id="27" w:name="_Toc234481653"/>
       <w:r>
+        <w:lastRenderedPageBreak/>
         <w:t>Development</w:t>
       </w:r>
       <w:bookmarkEnd w:id="26"/>
@@ -8350,7 +8952,6 @@
         <w:pStyle w:val="Heading2"/>
       </w:pPr>
       <w:r>
-        <w:lastRenderedPageBreak/>
         <w:t xml:space="preserve"> </w:t>
       </w:r>
       <w:bookmarkStart w:id="28" w:name="_Toc234481654"/>
@@ -11136,7 +11737,6 @@
               <w:rPr>
                 <w:sz w:val="22"/>
               </w:rPr>
-              <w:lastRenderedPageBreak/>
               <w:t>103</w:t>
             </w:r>
           </w:p>
@@ -12110,12 +12710,7 @@
       </w:pPr>
     </w:p>
     <w:sectPr>
-      <w:headerReference w:type="even" r:id="rId16"/>
-      <w:headerReference w:type="default" r:id="rId17"/>
-      <w:footerReference w:type="even" r:id="rId18"/>
-      <w:footerReference w:type="default" r:id="rId19"/>
-      <w:headerReference w:type="first" r:id="rId20"/>
-      <w:footerReference w:type="first" r:id="rId21"/>
+      <w:footerReference w:type="default" r:id="rId16"/>
       <w:pgSz w:w="11906" w:h="16838" w:code="9"/>
       <w:pgMar w:top="1440" w:right="1440" w:bottom="1440" w:left="2160" w:header="720" w:footer="720" w:gutter="0"/>
       <w:cols w:space="720"/>
@@ -12151,16 +12746,6 @@
 </file>
 
 <file path=word/footer1.xml><?xml version="1.0" encoding="utf-8"?>
-<w:ftr xmlns:wpc="http://schemas.microsoft.com/office/word/2010/wordprocessingCanvas" xmlns:cx="http://schemas.microsoft.com/office/drawing/2014/chartex" xmlns:cx1="http://schemas.microsoft.com/office/drawing/2015/9/8/chartex" xmlns:cx2="http://schemas.microsoft.com/office/drawing/2015/10/21/chartex" xmlns:cx3="http://schemas.microsoft.com/office/drawing/2016/5/9/chartex" xmlns:cx4="http://schemas.microsoft.com/office/drawing/2016/5/10/chartex" xmlns:cx5="http://schemas.microsoft.com/office/drawing/2016/5/11/chartex" xmlns:cx6="http://schemas.microsoft.com/office/drawing/2016/5/12/chartex" xmlns:cx7="http://schemas.microsoft.com/office/drawing/2016/5/13/chartex" xmlns:cx8="http://schemas.microsoft.com/office/drawing/2016/5/14/chartex" xmlns:mc="http://schemas.openxmlformats.org/markup-compatibility/2006" xmlns:aink="http://schemas.microsoft.com/office/drawing/2016/ink" xmlns:am3d="http://schemas.microsoft.com/office/drawing/2017/model3d" xmlns:o="urn:schemas-microsoft-com:office:office" xmlns:r="http://schemas.openxmlformats.org/officeDocument/2006/relationships" xmlns:m="http://schemas.openxmlformats.org/officeDocument/2006/math" xmlns:v="urn:schemas-microsoft-com:vml" xmlns:wp14="http://schemas.microsoft.com/office/word/2010/wordprocessingDrawing" xmlns:wp="http://schemas.openxmlformats.org/drawingml/2006/wordprocessingDrawing" xmlns:w10="urn:schemas-microsoft-com:office:word" xmlns:w="http://schemas.openxmlformats.org/wordprocessingml/2006/main" xmlns:w14="http://schemas.microsoft.com/office/word/2010/wordml" xmlns:w15="http://schemas.microsoft.com/office/word/2012/wordml" xmlns:w16cid="http://schemas.microsoft.com/office/word/2016/wordml/cid" xmlns:w16se="http://schemas.microsoft.com/office/word/2015/wordml/symex" xmlns:wpg="http://schemas.microsoft.com/office/word/2010/wordprocessingGroup" xmlns:wpi="http://schemas.microsoft.com/office/word/2010/wordprocessingInk" xmlns:wne="http://schemas.microsoft.com/office/word/2006/wordml" xmlns:wps="http://schemas.microsoft.com/office/word/2010/wordprocessingShape" mc:Ignorable="w14 w15 w16se w16cid wp14">
-  <w:p>
-    <w:pPr>
-      <w:pStyle w:val="Footer"/>
-    </w:pPr>
-  </w:p>
-</w:ftr>
-</file>
-
-<file path=word/footer2.xml><?xml version="1.0" encoding="utf-8"?>
 <w:ftr xmlns:wpc="http://schemas.microsoft.com/office/word/2010/wordprocessingCanvas" xmlns:cx="http://schemas.microsoft.com/office/drawing/2014/chartex" xmlns:cx1="http://schemas.microsoft.com/office/drawing/2015/9/8/chartex" xmlns:cx2="http://schemas.microsoft.com/office/drawing/2015/10/21/chartex" xmlns:cx3="http://schemas.microsoft.com/office/drawing/2016/5/9/chartex" xmlns:cx4="http://schemas.microsoft.com/office/drawing/2016/5/10/chartex" xmlns:cx5="http://schemas.microsoft.com/office/drawing/2016/5/11/chartex" xmlns:cx6="http://schemas.microsoft.com/office/drawing/2016/5/12/chartex" xmlns:cx7="http://schemas.microsoft.com/office/drawing/2016/5/13/chartex" xmlns:cx8="http://schemas.microsoft.com/office/drawing/2016/5/14/chartex" xmlns:mc="http://schemas.openxmlformats.org/markup-compatibility/2006" xmlns:aink="http://schemas.microsoft.com/office/drawing/2016/ink" xmlns:am3d="http://schemas.microsoft.com/office/drawing/2017/model3d" xmlns:o="urn:schemas-microsoft-com:office:office" xmlns:r="http://schemas.openxmlformats.org/officeDocument/2006/relationships" xmlns:m="http://schemas.openxmlformats.org/officeDocument/2006/math" xmlns:v="urn:schemas-microsoft-com:vml" xmlns:wp14="http://schemas.microsoft.com/office/word/2010/wordprocessingDrawing" xmlns:wp="http://schemas.openxmlformats.org/drawingml/2006/wordprocessingDrawing" xmlns:w10="urn:schemas-microsoft-com:office:word" xmlns:w="http://schemas.openxmlformats.org/wordprocessingml/2006/main" xmlns:w14="http://schemas.microsoft.com/office/word/2010/wordml" xmlns:w15="http://schemas.microsoft.com/office/word/2012/wordml" xmlns:w16cid="http://schemas.microsoft.com/office/word/2016/wordml/cid" xmlns:w16se="http://schemas.microsoft.com/office/word/2015/wordml/symex" xmlns:wpg="http://schemas.microsoft.com/office/word/2010/wordprocessingGroup" xmlns:wpi="http://schemas.microsoft.com/office/word/2010/wordprocessingInk" xmlns:wne="http://schemas.microsoft.com/office/word/2006/wordml" xmlns:wps="http://schemas.microsoft.com/office/word/2010/wordprocessingShape" mc:Ignorable="w14 w15 w16se w16cid wp14">
   <w:sdt>
     <w:sdtPr>
@@ -12213,16 +12798,6 @@
 </w:ftr>
 </file>
 
-<file path=word/footer3.xml><?xml version="1.0" encoding="utf-8"?>
-<w:ftr xmlns:wpc="http://schemas.microsoft.com/office/word/2010/wordprocessingCanvas" xmlns:cx="http://schemas.microsoft.com/office/drawing/2014/chartex" xmlns:cx1="http://schemas.microsoft.com/office/drawing/2015/9/8/chartex" xmlns:cx2="http://schemas.microsoft.com/office/drawing/2015/10/21/chartex" xmlns:cx3="http://schemas.microsoft.com/office/drawing/2016/5/9/chartex" xmlns:cx4="http://schemas.microsoft.com/office/drawing/2016/5/10/chartex" xmlns:cx5="http://schemas.microsoft.com/office/drawing/2016/5/11/chartex" xmlns:cx6="http://schemas.microsoft.com/office/drawing/2016/5/12/chartex" xmlns:cx7="http://schemas.microsoft.com/office/drawing/2016/5/13/chartex" xmlns:cx8="http://schemas.microsoft.com/office/drawing/2016/5/14/chartex" xmlns:mc="http://schemas.openxmlformats.org/markup-compatibility/2006" xmlns:aink="http://schemas.microsoft.com/office/drawing/2016/ink" xmlns:am3d="http://schemas.microsoft.com/office/drawing/2017/model3d" xmlns:o="urn:schemas-microsoft-com:office:office" xmlns:r="http://schemas.openxmlformats.org/officeDocument/2006/relationships" xmlns:m="http://schemas.openxmlformats.org/officeDocument/2006/math" xmlns:v="urn:schemas-microsoft-com:vml" xmlns:wp14="http://schemas.microsoft.com/office/word/2010/wordprocessingDrawing" xmlns:wp="http://schemas.openxmlformats.org/drawingml/2006/wordprocessingDrawing" xmlns:w10="urn:schemas-microsoft-com:office:word" xmlns:w="http://schemas.openxmlformats.org/wordprocessingml/2006/main" xmlns:w14="http://schemas.microsoft.com/office/word/2010/wordml" xmlns:w15="http://schemas.microsoft.com/office/word/2012/wordml" xmlns:w16cid="http://schemas.microsoft.com/office/word/2016/wordml/cid" xmlns:w16se="http://schemas.microsoft.com/office/word/2015/wordml/symex" xmlns:wpg="http://schemas.microsoft.com/office/word/2010/wordprocessingGroup" xmlns:wpi="http://schemas.microsoft.com/office/word/2010/wordprocessingInk" xmlns:wne="http://schemas.microsoft.com/office/word/2006/wordml" xmlns:wps="http://schemas.microsoft.com/office/word/2010/wordprocessingShape" mc:Ignorable="w14 w15 w16se w16cid wp14">
-  <w:p>
-    <w:pPr>
-      <w:pStyle w:val="Footer"/>
-    </w:pPr>
-  </w:p>
-</w:ftr>
-</file>
-
 <file path=word/footnotes.xml><?xml version="1.0" encoding="utf-8"?>
 <w:footnotes xmlns:wpc="http://schemas.microsoft.com/office/word/2010/wordprocessingCanvas" xmlns:cx="http://schemas.microsoft.com/office/drawing/2014/chartex" xmlns:cx1="http://schemas.microsoft.com/office/drawing/2015/9/8/chartex" xmlns:cx2="http://schemas.microsoft.com/office/drawing/2015/10/21/chartex" xmlns:cx3="http://schemas.microsoft.com/office/drawing/2016/5/9/chartex" xmlns:cx4="http://schemas.microsoft.com/office/drawing/2016/5/10/chartex" xmlns:cx5="http://schemas.microsoft.com/office/drawing/2016/5/11/chartex" xmlns:cx6="http://schemas.microsoft.com/office/drawing/2016/5/12/chartex" xmlns:cx7="http://schemas.microsoft.com/office/drawing/2016/5/13/chartex" xmlns:cx8="http://schemas.microsoft.com/office/drawing/2016/5/14/chartex" xmlns:mc="http://schemas.openxmlformats.org/markup-compatibility/2006" xmlns:aink="http://schemas.microsoft.com/office/drawing/2016/ink" xmlns:am3d="http://schemas.microsoft.com/office/drawing/2017/model3d" xmlns:o="urn:schemas-microsoft-com:office:office" xmlns:r="http://schemas.openxmlformats.org/officeDocument/2006/relationships" xmlns:m="http://schemas.openxmlformats.org/officeDocument/2006/math" xmlns:v="urn:schemas-microsoft-com:vml" xmlns:wp14="http://schemas.microsoft.com/office/word/2010/wordprocessingDrawing" xmlns:wp="http://schemas.openxmlformats.org/drawingml/2006/wordprocessingDrawing" xmlns:w10="urn:schemas-microsoft-com:office:word" xmlns:w="http://schemas.openxmlformats.org/wordprocessingml/2006/main" xmlns:w14="http://schemas.microsoft.com/office/word/2010/wordml" xmlns:w15="http://schemas.microsoft.com/office/word/2012/wordml" xmlns:w16cid="http://schemas.microsoft.com/office/word/2016/wordml/cid" xmlns:w16se="http://schemas.microsoft.com/office/word/2015/wordml/symex" xmlns:wpg="http://schemas.microsoft.com/office/word/2010/wordprocessingGroup" xmlns:wpi="http://schemas.microsoft.com/office/word/2010/wordprocessingInk" xmlns:wne="http://schemas.microsoft.com/office/word/2006/wordml" xmlns:wps="http://schemas.microsoft.com/office/word/2010/wordprocessingShape" mc:Ignorable="w14 w15 w16se w16cid wp14">
   <w:footnote w:type="separator" w:id="-1">
@@ -12246,36 +12821,6 @@
     </w:p>
   </w:footnote>
 </w:footnotes>
-</file>
-
-<file path=word/header1.xml><?xml version="1.0" encoding="utf-8"?>
-<w:hdr xmlns:wpc="http://schemas.microsoft.com/office/word/2010/wordprocessingCanvas" xmlns:cx="http://schemas.microsoft.com/office/drawing/2014/chartex" xmlns:cx1="http://schemas.microsoft.com/office/drawing/2015/9/8/chartex" xmlns:cx2="http://schemas.microsoft.com/office/drawing/2015/10/21/chartex" xmlns:cx3="http://schemas.microsoft.com/office/drawing/2016/5/9/chartex" xmlns:cx4="http://schemas.microsoft.com/office/drawing/2016/5/10/chartex" xmlns:cx5="http://schemas.microsoft.com/office/drawing/2016/5/11/chartex" xmlns:cx6="http://schemas.microsoft.com/office/drawing/2016/5/12/chartex" xmlns:cx7="http://schemas.microsoft.com/office/drawing/2016/5/13/chartex" xmlns:cx8="http://schemas.microsoft.com/office/drawing/2016/5/14/chartex" xmlns:mc="http://schemas.openxmlformats.org/markup-compatibility/2006" xmlns:aink="http://schemas.microsoft.com/office/drawing/2016/ink" xmlns:am3d="http://schemas.microsoft.com/office/drawing/2017/model3d" xmlns:o="urn:schemas-microsoft-com:office:office" xmlns:r="http://schemas.openxmlformats.org/officeDocument/2006/relationships" xmlns:m="http://schemas.openxmlformats.org/officeDocument/2006/math" xmlns:v="urn:schemas-microsoft-com:vml" xmlns:wp14="http://schemas.microsoft.com/office/word/2010/wordprocessingDrawing" xmlns:wp="http://schemas.openxmlformats.org/drawingml/2006/wordprocessingDrawing" xmlns:w10="urn:schemas-microsoft-com:office:word" xmlns:w="http://schemas.openxmlformats.org/wordprocessingml/2006/main" xmlns:w14="http://schemas.microsoft.com/office/word/2010/wordml" xmlns:w15="http://schemas.microsoft.com/office/word/2012/wordml" xmlns:w16cid="http://schemas.microsoft.com/office/word/2016/wordml/cid" xmlns:w16se="http://schemas.microsoft.com/office/word/2015/wordml/symex" xmlns:wpg="http://schemas.microsoft.com/office/word/2010/wordprocessingGroup" xmlns:wpi="http://schemas.microsoft.com/office/word/2010/wordprocessingInk" xmlns:wne="http://schemas.microsoft.com/office/word/2006/wordml" xmlns:wps="http://schemas.microsoft.com/office/word/2010/wordprocessingShape" mc:Ignorable="w14 w15 w16se w16cid wp14">
-  <w:p>
-    <w:pPr>
-      <w:pStyle w:val="Header"/>
-    </w:pPr>
-  </w:p>
-</w:hdr>
-</file>
-
-<file path=word/header2.xml><?xml version="1.0" encoding="utf-8"?>
-<w:hdr xmlns:wpc="http://schemas.microsoft.com/office/word/2010/wordprocessingCanvas" xmlns:cx="http://schemas.microsoft.com/office/drawing/2014/chartex" xmlns:cx1="http://schemas.microsoft.com/office/drawing/2015/9/8/chartex" xmlns:cx2="http://schemas.microsoft.com/office/drawing/2015/10/21/chartex" xmlns:cx3="http://schemas.microsoft.com/office/drawing/2016/5/9/chartex" xmlns:cx4="http://schemas.microsoft.com/office/drawing/2016/5/10/chartex" xmlns:cx5="http://schemas.microsoft.com/office/drawing/2016/5/11/chartex" xmlns:cx6="http://schemas.microsoft.com/office/drawing/2016/5/12/chartex" xmlns:cx7="http://schemas.microsoft.com/office/drawing/2016/5/13/chartex" xmlns:cx8="http://schemas.microsoft.com/office/drawing/2016/5/14/chartex" xmlns:mc="http://schemas.openxmlformats.org/markup-compatibility/2006" xmlns:aink="http://schemas.microsoft.com/office/drawing/2016/ink" xmlns:am3d="http://schemas.microsoft.com/office/drawing/2017/model3d" xmlns:o="urn:schemas-microsoft-com:office:office" xmlns:r="http://schemas.openxmlformats.org/officeDocument/2006/relationships" xmlns:m="http://schemas.openxmlformats.org/officeDocument/2006/math" xmlns:v="urn:schemas-microsoft-com:vml" xmlns:wp14="http://schemas.microsoft.com/office/word/2010/wordprocessingDrawing" xmlns:wp="http://schemas.openxmlformats.org/drawingml/2006/wordprocessingDrawing" xmlns:w10="urn:schemas-microsoft-com:office:word" xmlns:w="http://schemas.openxmlformats.org/wordprocessingml/2006/main" xmlns:w14="http://schemas.microsoft.com/office/word/2010/wordml" xmlns:w15="http://schemas.microsoft.com/office/word/2012/wordml" xmlns:w16cid="http://schemas.microsoft.com/office/word/2016/wordml/cid" xmlns:w16se="http://schemas.microsoft.com/office/word/2015/wordml/symex" xmlns:wpg="http://schemas.microsoft.com/office/word/2010/wordprocessingGroup" xmlns:wpi="http://schemas.microsoft.com/office/word/2010/wordprocessingInk" xmlns:wne="http://schemas.microsoft.com/office/word/2006/wordml" xmlns:wps="http://schemas.microsoft.com/office/word/2010/wordprocessingShape" mc:Ignorable="w14 w15 w16se w16cid wp14">
-  <w:p>
-    <w:pPr>
-      <w:pStyle w:val="Header"/>
-    </w:pPr>
-  </w:p>
-</w:hdr>
-</file>
-
-<file path=word/header3.xml><?xml version="1.0" encoding="utf-8"?>
-<w:hdr xmlns:wpc="http://schemas.microsoft.com/office/word/2010/wordprocessingCanvas" xmlns:cx="http://schemas.microsoft.com/office/drawing/2014/chartex" xmlns:cx1="http://schemas.microsoft.com/office/drawing/2015/9/8/chartex" xmlns:cx2="http://schemas.microsoft.com/office/drawing/2015/10/21/chartex" xmlns:cx3="http://schemas.microsoft.com/office/drawing/2016/5/9/chartex" xmlns:cx4="http://schemas.microsoft.com/office/drawing/2016/5/10/chartex" xmlns:cx5="http://schemas.microsoft.com/office/drawing/2016/5/11/chartex" xmlns:cx6="http://schemas.microsoft.com/office/drawing/2016/5/12/chartex" xmlns:cx7="http://schemas.microsoft.com/office/drawing/2016/5/13/chartex" xmlns:cx8="http://schemas.microsoft.com/office/drawing/2016/5/14/chartex" xmlns:mc="http://schemas.openxmlformats.org/markup-compatibility/2006" xmlns:aink="http://schemas.microsoft.com/office/drawing/2016/ink" xmlns:am3d="http://schemas.microsoft.com/office/drawing/2017/model3d" xmlns:o="urn:schemas-microsoft-com:office:office" xmlns:r="http://schemas.openxmlformats.org/officeDocument/2006/relationships" xmlns:m="http://schemas.openxmlformats.org/officeDocument/2006/math" xmlns:v="urn:schemas-microsoft-com:vml" xmlns:wp14="http://schemas.microsoft.com/office/word/2010/wordprocessingDrawing" xmlns:wp="http://schemas.openxmlformats.org/drawingml/2006/wordprocessingDrawing" xmlns:w10="urn:schemas-microsoft-com:office:word" xmlns:w="http://schemas.openxmlformats.org/wordprocessingml/2006/main" xmlns:w14="http://schemas.microsoft.com/office/word/2010/wordml" xmlns:w15="http://schemas.microsoft.com/office/word/2012/wordml" xmlns:w16cid="http://schemas.microsoft.com/office/word/2016/wordml/cid" xmlns:w16se="http://schemas.microsoft.com/office/word/2015/wordml/symex" xmlns:wpg="http://schemas.microsoft.com/office/word/2010/wordprocessingGroup" xmlns:wpi="http://schemas.microsoft.com/office/word/2010/wordprocessingInk" xmlns:wne="http://schemas.microsoft.com/office/word/2006/wordml" xmlns:wps="http://schemas.microsoft.com/office/word/2010/wordprocessingShape" mc:Ignorable="w14 w15 w16se w16cid wp14">
-  <w:p>
-    <w:pPr>
-      <w:pStyle w:val="Header"/>
-    </w:pPr>
-  </w:p>
-</w:hdr>
 </file>
 
 <file path=word/numbering.xml><?xml version="1.0" encoding="utf-8"?>
@@ -13055,7 +13600,7 @@
     <w:name w:val="Normal"/>
     <w:aliases w:val="Normal Text"/>
     <w:qFormat/>
-    <w:rsid w:val="00F31CE3"/>
+    <w:rsid w:val="0055665C"/>
     <w:rPr>
       <w:rFonts w:ascii="Times New Roman" w:hAnsi="Times New Roman"/>
       <w:sz w:val="24"/>
@@ -14922,21 +15467,21 @@
     <w:charset w:val="00"/>
     <w:family w:val="roman"/>
     <w:pitch w:val="variable"/>
-    <w:sig w:usb0="E0002AFF" w:usb1="C0007843" w:usb2="00000009" w:usb3="00000000" w:csb0="000001FF" w:csb1="00000000"/>
+    <w:sig w:usb0="E0002EFF" w:usb1="C000785B" w:usb2="00000009" w:usb3="00000000" w:csb0="000001FF" w:csb1="00000000"/>
   </w:font>
   <w:font w:name="Calibri">
     <w:panose1 w:val="020F0502020204030204"/>
     <w:charset w:val="00"/>
     <w:family w:val="swiss"/>
     <w:pitch w:val="variable"/>
-    <w:sig w:usb0="E00002FF" w:usb1="4000ACFF" w:usb2="00000001" w:usb3="00000000" w:csb0="0000019F" w:csb1="00000000"/>
+    <w:sig w:usb0="E4002EFF" w:usb1="C200247B" w:usb2="00000009" w:usb3="00000000" w:csb0="000001FF" w:csb1="00000000"/>
   </w:font>
   <w:font w:name="Calibri Light">
     <w:panose1 w:val="020F0302020204030204"/>
     <w:charset w:val="00"/>
     <w:family w:val="swiss"/>
     <w:pitch w:val="variable"/>
-    <w:sig w:usb0="A00002EF" w:usb1="4000207B" w:usb2="00000000" w:usb3="00000000" w:csb0="0000009F" w:csb1="00000000"/>
+    <w:sig w:usb0="E4002EFF" w:usb1="C200247B" w:usb2="00000009" w:usb3="00000000" w:csb0="000001FF" w:csb1="00000000"/>
   </w:font>
   <w:font w:name="Tahoma">
     <w:panose1 w:val="020B0604030504040204"/>
@@ -14989,6 +15534,7 @@
     <w:rsid w:val="00743365"/>
     <w:rsid w:val="007810D4"/>
     <w:rsid w:val="00840937"/>
+    <w:rsid w:val="008A76FF"/>
     <w:rsid w:val="00911117"/>
     <w:rsid w:val="00952ECC"/>
     <w:rsid w:val="009E7A4F"/>
@@ -15963,18 +16509,18 @@
 </file>
 
 <file path=customXml/item2.xml><?xml version="1.0" encoding="utf-8"?>
+<p:properties xmlns:p="http://schemas.microsoft.com/office/2006/metadata/properties" xmlns:xsi="http://www.w3.org/2001/XMLSchema-instance" xmlns:pc="http://schemas.microsoft.com/office/infopath/2007/PartnerControls">
+  <documentManagement/>
+</p:properties>
+</file>
+
+<file path=customXml/item3.xml><?xml version="1.0" encoding="utf-8"?>
 <?mso-contentType ?>
 <FormTemplates xmlns="http://schemas.microsoft.com/sharepoint/v3/contenttype/forms">
   <Display>DocumentLibraryForm</Display>
   <Edit>DocumentLibraryForm</Edit>
   <New>DocumentLibraryForm</New>
 </FormTemplates>
-</file>
-
-<file path=customXml/item3.xml><?xml version="1.0" encoding="utf-8"?>
-<p:properties xmlns:p="http://schemas.microsoft.com/office/2006/metadata/properties" xmlns:xsi="http://www.w3.org/2001/XMLSchema-instance" xmlns:pc="http://schemas.microsoft.com/office/infopath/2007/PartnerControls">
-  <documentManagement/>
-</p:properties>
 </file>
 
 <file path=customXml/item4.xml><?xml version="1.0" encoding="utf-8"?>
@@ -16018,14 +16564,6 @@
 </file>
 
 <file path=customXml/itemProps2.xml><?xml version="1.0" encoding="utf-8"?>
-<ds:datastoreItem xmlns:ds="http://schemas.openxmlformats.org/officeDocument/2006/customXml" ds:itemID="{56C44748-5791-4773-80AF-F953C3055353}">
-  <ds:schemaRefs>
-    <ds:schemaRef ds:uri="http://schemas.microsoft.com/sharepoint/v3/contenttype/forms"/>
-  </ds:schemaRefs>
-</ds:datastoreItem>
-</file>
-
-<file path=customXml/itemProps3.xml><?xml version="1.0" encoding="utf-8"?>
 <ds:datastoreItem xmlns:ds="http://schemas.openxmlformats.org/officeDocument/2006/customXml" ds:itemID="{279A32A1-94B8-4C38-AF26-42DBFF0B0D86}">
   <ds:schemaRefs>
     <ds:schemaRef ds:uri="http://schemas.microsoft.com/office/2006/metadata/properties"/>
@@ -16034,8 +16572,16 @@
 </ds:datastoreItem>
 </file>
 
+<file path=customXml/itemProps3.xml><?xml version="1.0" encoding="utf-8"?>
+<ds:datastoreItem xmlns:ds="http://schemas.openxmlformats.org/officeDocument/2006/customXml" ds:itemID="{56C44748-5791-4773-80AF-F953C3055353}">
+  <ds:schemaRefs>
+    <ds:schemaRef ds:uri="http://schemas.microsoft.com/sharepoint/v3/contenttype/forms"/>
+  </ds:schemaRefs>
+</ds:datastoreItem>
+</file>
+
 <file path=customXml/itemProps4.xml><?xml version="1.0" encoding="utf-8"?>
-<ds:datastoreItem xmlns:ds="http://schemas.openxmlformats.org/officeDocument/2006/customXml" ds:itemID="{8907C4CE-9A39-4C3A-B709-68E9CCA3C8ED}">
+<ds:datastoreItem xmlns:ds="http://schemas.openxmlformats.org/officeDocument/2006/customXml" ds:itemID="{22F7C586-AE3E-414B-B4D1-531448C430C5}">
   <ds:schemaRefs>
     <ds:schemaRef ds:uri="http://schemas.openxmlformats.org/officeDocument/2006/bibliography"/>
   </ds:schemaRefs>

</xml_diff>